<commit_message>
md2word: update 斯可睿抬头 template
</commit_message>
<xml_diff>
--- a/skills/md2word/assets/letterhead/斯可睿抬头.docx
+++ b/skills/md2word/assets/letterhead/斯可睿抬头.docx
@@ -15,8 +15,42 @@
       </w:r>
     </w:p>
     <w:p>
-      <w:r>
-        <w:t>updated :: &lt;%+ tp.file.last_modified_date("YYYY-MM-DD HH:mm") %&gt;</w:t>
+      <w:proofErr w:type="gramStart"/>
+      <w:r>
+        <w:t>updated :</w:t>
+      </w:r>
+      <w:proofErr w:type="gramEnd"/>
+      <w:r>
+        <w:t xml:space="preserve">: &lt;%+ </w:t>
+      </w:r>
+      <w:proofErr w:type="spellStart"/>
+      <w:proofErr w:type="gramStart"/>
+      <w:r>
+        <w:t>tp.file</w:t>
+      </w:r>
+      <w:proofErr w:type="gramEnd"/>
+      <w:r>
+        <w:t>.last_modified_</w:t>
+      </w:r>
+      <w:proofErr w:type="gramStart"/>
+      <w:r>
+        <w:t>date</w:t>
+      </w:r>
+      <w:proofErr w:type="spellEnd"/>
+      <w:r>
+        <w:t>(</w:t>
+      </w:r>
+      <w:proofErr w:type="gramEnd"/>
+      <w:r>
+        <w:t xml:space="preserve">"YYYY-MM-DD </w:t>
+      </w:r>
+      <w:proofErr w:type="spellStart"/>
+      <w:r>
+        <w:t>HH:mm</w:t>
+      </w:r>
+      <w:proofErr w:type="spellEnd"/>
+      <w:r>
+        <w:t>") %&gt;</w:t>
       </w:r>
     </w:p>
     <w:p>
@@ -42,42 +76,134 @@
         <w:pStyle w:val="SourceCode"/>
       </w:pPr>
       <w:r>
-        <w:t xml:space="preserve">// </w:t>
-      </w:r>
-      <w:r>
-        <w:t>修改其中的时间，可以输出当前离倒计时的时间差。</w:t>
+        <w:t>/</w:t>
+      </w:r>
+      <w:proofErr w:type="gramStart"/>
+      <w:r>
+        <w:t xml:space="preserve">/ </w:t>
+      </w:r>
+      <w:r>
+        <w:t>修改</w:t>
+      </w:r>
+      <w:proofErr w:type="gramEnd"/>
+      <w:r>
+        <w:t>其中的时间，可以输出当前离倒计时的时间差。</w:t>
       </w:r>
       <w:r>
         <w:br/>
-        <w:t>const setTime1 = new Date("2021/12/30");</w:t>
+        <w:t>const setTime1 = new Date("</w:t>
+      </w:r>
+      <w:proofErr w:type="gramStart"/>
+      <w:r>
+        <w:t>2021/12/30")</w:t>
+      </w:r>
+      <w:proofErr w:type="gramEnd"/>
+      <w:r>
+        <w:t>;</w:t>
       </w:r>
       <w:r>
         <w:br/>
-        <w:t>const setTime2 = new Date("2019/09/20");</w:t>
+        <w:t>const setTime2 = new Date("</w:t>
+      </w:r>
+      <w:proofErr w:type="gramStart"/>
+      <w:r>
+        <w:t>2019/09/20")</w:t>
+      </w:r>
+      <w:proofErr w:type="gramEnd"/>
+      <w:r>
+        <w:t>;</w:t>
       </w:r>
       <w:r>
         <w:br/>
-        <w:t>const nowTime = new Date("2022-03-31");</w:t>
+        <w:t xml:space="preserve">const </w:t>
+      </w:r>
+      <w:proofErr w:type="spellStart"/>
+      <w:r>
+        <w:t>nowTime</w:t>
+      </w:r>
+      <w:proofErr w:type="spellEnd"/>
+      <w:r>
+        <w:t xml:space="preserve"> = new Date("</w:t>
+      </w:r>
+      <w:proofErr w:type="gramStart"/>
+      <w:r>
+        <w:t>2022-03-31")</w:t>
+      </w:r>
+      <w:proofErr w:type="gramEnd"/>
+      <w:r>
+        <w:t>;</w:t>
       </w:r>
       <w:r>
         <w:br/>
-        <w:t>const restSec1 = setTime1.getTime() - nowTime.getTime();</w:t>
+        <w:t xml:space="preserve">const restSec1 = setTime1.getTime() - </w:t>
+      </w:r>
+      <w:proofErr w:type="spellStart"/>
+      <w:r>
+        <w:t>nowTime.getTime</w:t>
+      </w:r>
+      <w:proofErr w:type="spellEnd"/>
+      <w:r>
+        <w:t>();</w:t>
       </w:r>
       <w:r>
         <w:br/>
-        <w:t>const restSec2 = setTime2.getTime() - nowTime.getTime();</w:t>
+        <w:t xml:space="preserve">const restSec2 = setTime2.getTime() - </w:t>
+      </w:r>
+      <w:proofErr w:type="spellStart"/>
+      <w:r>
+        <w:t>nowTime.getTime</w:t>
+      </w:r>
+      <w:proofErr w:type="spellEnd"/>
+      <w:r>
+        <w:t>();</w:t>
       </w:r>
       <w:r>
         <w:br/>
-        <w:t>const day1 = - parseInt(restSec1 / (60*60*24*1000));</w:t>
+        <w:t xml:space="preserve">const day1 = - </w:t>
+      </w:r>
+      <w:proofErr w:type="spellStart"/>
+      <w:r>
+        <w:t>parseInt</w:t>
+      </w:r>
+      <w:proofErr w:type="spellEnd"/>
+      <w:r>
+        <w:t xml:space="preserve">(restSec1 / </w:t>
+      </w:r>
+      <w:proofErr w:type="gramStart"/>
+      <w:r>
+        <w:t>(60*60*24*1000)</w:t>
+      </w:r>
+      <w:proofErr w:type="gramEnd"/>
+      <w:r>
+        <w:t>);</w:t>
       </w:r>
       <w:r>
         <w:br/>
-        <w:t>const day2 = - parseInt(restSec2 / (60*60*24*1000));</w:t>
+        <w:t xml:space="preserve">const day2 = - </w:t>
+      </w:r>
+      <w:proofErr w:type="spellStart"/>
+      <w:r>
+        <w:t>parseInt</w:t>
+      </w:r>
+      <w:proofErr w:type="spellEnd"/>
+      <w:r>
+        <w:t xml:space="preserve">(restSec2 / </w:t>
+      </w:r>
+      <w:proofErr w:type="gramStart"/>
+      <w:r>
+        <w:t>(60*60*24*1000)</w:t>
+      </w:r>
+      <w:proofErr w:type="gramEnd"/>
+      <w:r>
+        <w:t>);</w:t>
       </w:r>
       <w:r>
         <w:br/>
-        <w:t xml:space="preserve">const str1 = "## </w:t>
+        <w:t xml:space="preserve">const str1 = </w:t>
+      </w:r>
+      <w:proofErr w:type="gramStart"/>
+      <w:r>
+        <w:t xml:space="preserve">"## </w:t>
       </w:r>
       <w:r>
         <w:rPr>
@@ -85,21 +211,42 @@
         </w:rPr>
         <w:t>❤</w:t>
       </w:r>
-      <w:r>
-        <w:t>二宝出生</w:t>
-      </w:r>
-      <w:r>
-        <w:t>" + day1 + "</w:t>
-      </w:r>
-      <w:r>
-        <w:t>天啦</w:t>
+      <w:proofErr w:type="gramEnd"/>
+      <w:r>
+        <w:t>二宝</w:t>
+      </w:r>
+      <w:proofErr w:type="gramStart"/>
+      <w:r>
+        <w:t>出生</w:t>
+      </w:r>
+      <w:r>
+        <w:t>"</w:t>
+      </w:r>
+      <w:proofErr w:type="gramEnd"/>
+      <w:r>
+        <w:t xml:space="preserve"> + day1 + </w:t>
+      </w:r>
+      <w:proofErr w:type="gramStart"/>
+      <w:r>
+        <w:t>"</w:t>
+      </w:r>
+      <w:r>
+        <w:t>天</w:t>
+      </w:r>
+      <w:proofErr w:type="gramEnd"/>
+      <w:r>
+        <w:t>啦</w:t>
       </w:r>
       <w:r>
         <w:t>";</w:t>
       </w:r>
       <w:r>
         <w:br/>
-        <w:t xml:space="preserve">const str2 = "## </w:t>
+        <w:t xml:space="preserve">const str2 = </w:t>
+      </w:r>
+      <w:proofErr w:type="gramStart"/>
+      <w:r>
+        <w:t xml:space="preserve">"## </w:t>
       </w:r>
       <w:r>
         <w:rPr>
@@ -107,25 +254,66 @@
         </w:rPr>
         <w:t>❤</w:t>
       </w:r>
-      <w:r>
-        <w:t>悦悦出生</w:t>
-      </w:r>
-      <w:r>
-        <w:t>" + day2 + "</w:t>
-      </w:r>
-      <w:r>
-        <w:t>天啦</w:t>
+      <w:proofErr w:type="gramEnd"/>
+      <w:r>
+        <w:t>悦悦</w:t>
+      </w:r>
+      <w:proofErr w:type="gramStart"/>
+      <w:r>
+        <w:t>出生</w:t>
+      </w:r>
+      <w:r>
+        <w:t>"</w:t>
+      </w:r>
+      <w:proofErr w:type="gramEnd"/>
+      <w:r>
+        <w:t xml:space="preserve"> + day2 + </w:t>
+      </w:r>
+      <w:proofErr w:type="gramStart"/>
+      <w:r>
+        <w:t>"</w:t>
+      </w:r>
+      <w:r>
+        <w:t>天</w:t>
+      </w:r>
+      <w:proofErr w:type="gramEnd"/>
+      <w:r>
+        <w:t>啦</w:t>
       </w:r>
       <w:r>
         <w:t>";</w:t>
       </w:r>
       <w:r>
         <w:br/>
-        <w:t>dv.paragraph(str2);</w:t>
+      </w:r>
+      <w:proofErr w:type="spellStart"/>
+      <w:r>
+        <w:t>dv.paragraph</w:t>
+      </w:r>
+      <w:proofErr w:type="spellEnd"/>
+      <w:proofErr w:type="gramStart"/>
+      <w:r>
+        <w:t>(str2)</w:t>
+      </w:r>
+      <w:proofErr w:type="gramEnd"/>
+      <w:r>
+        <w:t>;</w:t>
       </w:r>
       <w:r>
         <w:br/>
-        <w:t>dv.paragraph(str1);</w:t>
+      </w:r>
+      <w:proofErr w:type="spellStart"/>
+      <w:r>
+        <w:t>dv.paragraph</w:t>
+      </w:r>
+      <w:proofErr w:type="spellEnd"/>
+      <w:proofErr w:type="gramStart"/>
+      <w:r>
+        <w:t>(str1)</w:t>
+      </w:r>
+      <w:proofErr w:type="gramEnd"/>
+      <w:r>
+        <w:t>;</w:t>
       </w:r>
     </w:p>
     <w:p>
@@ -148,17 +336,24 @@
         </w:numPr>
       </w:pPr>
       <w:r>
-        <w:t>东阳顶峰年费确认</w:t>
+        <w:t>东阳顶峰年费</w:t>
+      </w:r>
+      <w:proofErr w:type="gramStart"/>
+      <w:r>
+        <w:t>确认</w:t>
       </w:r>
       <w:r>
         <w:t xml:space="preserve"> [</w:t>
       </w:r>
+      <w:proofErr w:type="gramEnd"/>
       <w:r>
         <w:t>完成</w:t>
       </w:r>
+      <w:proofErr w:type="gramStart"/>
       <w:r>
         <w:t xml:space="preserve"> :: 2022-03-31] #</w:t>
       </w:r>
+      <w:proofErr w:type="gramEnd"/>
       <w:r>
         <w:t>张娜</w:t>
       </w:r>
@@ -235,7 +430,29 @@
           <w:szCs w:val="24"/>
           <w:shd w:val="pct5" w:color="auto" w:fill="auto"/>
         </w:rPr>
-        <w:t>task from -"00.</w:t>
+        <w:t>task from -</w:t>
+      </w:r>
+      <w:proofErr w:type="gramStart"/>
+      <w:r>
+        <w:rPr>
+          <w:rFonts w:eastAsia="PingFang SC" w:cs="Times New Roman (正文 CS 字体)"/>
+          <w:color w:val="404040" w:themeColor="text1" w:themeTint="BF"/>
+          <w:kern w:val="0"/>
+          <w:szCs w:val="24"/>
+          <w:shd w:val="pct5" w:color="auto" w:fill="auto"/>
+        </w:rPr>
+        <w:t>"00</w:t>
+      </w:r>
+      <w:proofErr w:type="gramEnd"/>
+      <w:r>
+        <w:rPr>
+          <w:rFonts w:eastAsia="PingFang SC" w:cs="Times New Roman (正文 CS 字体)"/>
+          <w:color w:val="404040" w:themeColor="text1" w:themeTint="BF"/>
+          <w:kern w:val="0"/>
+          <w:szCs w:val="24"/>
+          <w:shd w:val="pct5" w:color="auto" w:fill="auto"/>
+        </w:rPr>
+        <w:t>.</w:t>
       </w:r>
       <w:r>
         <w:rPr>
@@ -255,7 +472,18 @@
           <w:szCs w:val="24"/>
           <w:shd w:val="pct5" w:color="auto" w:fill="auto"/>
         </w:rPr>
-        <w:t>/checklist" and -"</w:t>
+        <w:t>/checklist" and -</w:t>
+      </w:r>
+      <w:proofErr w:type="gramStart"/>
+      <w:r>
+        <w:rPr>
+          <w:rFonts w:eastAsia="PingFang SC" w:cs="Times New Roman (正文 CS 字体)"/>
+          <w:color w:val="404040" w:themeColor="text1" w:themeTint="BF"/>
+          <w:kern w:val="0"/>
+          <w:szCs w:val="24"/>
+          <w:shd w:val="pct5" w:color="auto" w:fill="auto"/>
+        </w:rPr>
+        <w:t>"</w:t>
       </w:r>
       <w:r>
         <w:rPr>
@@ -275,7 +503,29 @@
           <w:szCs w:val="24"/>
           <w:shd w:val="pct5" w:color="auto" w:fill="auto"/>
         </w:rPr>
-        <w:t>" and -"</w:t>
+        <w:t>"</w:t>
+      </w:r>
+      <w:proofErr w:type="gramEnd"/>
+      <w:r>
+        <w:rPr>
+          <w:rFonts w:eastAsia="PingFang SC" w:cs="Times New Roman (正文 CS 字体)"/>
+          <w:color w:val="404040" w:themeColor="text1" w:themeTint="BF"/>
+          <w:kern w:val="0"/>
+          <w:szCs w:val="24"/>
+          <w:shd w:val="pct5" w:color="auto" w:fill="auto"/>
+        </w:rPr>
+        <w:t xml:space="preserve"> and -</w:t>
+      </w:r>
+      <w:proofErr w:type="gramStart"/>
+      <w:r>
+        <w:rPr>
+          <w:rFonts w:eastAsia="PingFang SC" w:cs="Times New Roman (正文 CS 字体)"/>
+          <w:color w:val="404040" w:themeColor="text1" w:themeTint="BF"/>
+          <w:kern w:val="0"/>
+          <w:szCs w:val="24"/>
+          <w:shd w:val="pct5" w:color="auto" w:fill="auto"/>
+        </w:rPr>
+        <w:t>"</w:t>
       </w:r>
       <w:r>
         <w:rPr>
@@ -295,7 +545,40 @@
           <w:szCs w:val="24"/>
           <w:shd w:val="pct5" w:color="auto" w:fill="auto"/>
         </w:rPr>
-        <w:t>" and -"01.</w:t>
+        <w:t>"</w:t>
+      </w:r>
+      <w:proofErr w:type="gramEnd"/>
+      <w:r>
+        <w:rPr>
+          <w:rFonts w:eastAsia="PingFang SC" w:cs="Times New Roman (正文 CS 字体)"/>
+          <w:color w:val="404040" w:themeColor="text1" w:themeTint="BF"/>
+          <w:kern w:val="0"/>
+          <w:szCs w:val="24"/>
+          <w:shd w:val="pct5" w:color="auto" w:fill="auto"/>
+        </w:rPr>
+        <w:t xml:space="preserve"> and -</w:t>
+      </w:r>
+      <w:proofErr w:type="gramStart"/>
+      <w:r>
+        <w:rPr>
+          <w:rFonts w:eastAsia="PingFang SC" w:cs="Times New Roman (正文 CS 字体)"/>
+          <w:color w:val="404040" w:themeColor="text1" w:themeTint="BF"/>
+          <w:kern w:val="0"/>
+          <w:szCs w:val="24"/>
+          <w:shd w:val="pct5" w:color="auto" w:fill="auto"/>
+        </w:rPr>
+        <w:t>"01</w:t>
+      </w:r>
+      <w:proofErr w:type="gramEnd"/>
+      <w:r>
+        <w:rPr>
+          <w:rFonts w:eastAsia="PingFang SC" w:cs="Times New Roman (正文 CS 字体)"/>
+          <w:color w:val="404040" w:themeColor="text1" w:themeTint="BF"/>
+          <w:kern w:val="0"/>
+          <w:szCs w:val="24"/>
+          <w:shd w:val="pct5" w:color="auto" w:fill="auto"/>
+        </w:rPr>
+        <w:t>.</w:t>
       </w:r>
       <w:r>
         <w:rPr>
@@ -317,6 +600,7 @@
         </w:rPr>
         <w:t>/</w:t>
       </w:r>
+      <w:proofErr w:type="gramStart"/>
       <w:r>
         <w:rPr>
           <w:rFonts w:eastAsia="PingFang SC" w:cs="Times New Roman (正文 CS 字体)"/>
@@ -335,7 +619,40 @@
           <w:szCs w:val="24"/>
           <w:shd w:val="pct5" w:color="auto" w:fill="auto"/>
         </w:rPr>
-        <w:t>" and -"01.</w:t>
+        <w:t>"</w:t>
+      </w:r>
+      <w:proofErr w:type="gramEnd"/>
+      <w:r>
+        <w:rPr>
+          <w:rFonts w:eastAsia="PingFang SC" w:cs="Times New Roman (正文 CS 字体)"/>
+          <w:color w:val="404040" w:themeColor="text1" w:themeTint="BF"/>
+          <w:kern w:val="0"/>
+          <w:szCs w:val="24"/>
+          <w:shd w:val="pct5" w:color="auto" w:fill="auto"/>
+        </w:rPr>
+        <w:t xml:space="preserve"> and -</w:t>
+      </w:r>
+      <w:proofErr w:type="gramStart"/>
+      <w:r>
+        <w:rPr>
+          <w:rFonts w:eastAsia="PingFang SC" w:cs="Times New Roman (正文 CS 字体)"/>
+          <w:color w:val="404040" w:themeColor="text1" w:themeTint="BF"/>
+          <w:kern w:val="0"/>
+          <w:szCs w:val="24"/>
+          <w:shd w:val="pct5" w:color="auto" w:fill="auto"/>
+        </w:rPr>
+        <w:t>"01</w:t>
+      </w:r>
+      <w:proofErr w:type="gramEnd"/>
+      <w:r>
+        <w:rPr>
+          <w:rFonts w:eastAsia="PingFang SC" w:cs="Times New Roman (正文 CS 字体)"/>
+          <w:color w:val="404040" w:themeColor="text1" w:themeTint="BF"/>
+          <w:kern w:val="0"/>
+          <w:szCs w:val="24"/>
+          <w:shd w:val="pct5" w:color="auto" w:fill="auto"/>
+        </w:rPr>
+        <w:t>.</w:t>
       </w:r>
       <w:r>
         <w:rPr>
@@ -365,7 +682,18 @@
           <w:szCs w:val="24"/>
           <w:shd w:val="pct5" w:color="auto" w:fill="auto"/>
         </w:rPr>
-        <w:t>工作资料</w:t>
+        <w:t>工作</w:t>
+      </w:r>
+      <w:proofErr w:type="gramStart"/>
+      <w:r>
+        <w:rPr>
+          <w:rFonts w:eastAsia="PingFang SC" w:cs="Times New Roman (正文 CS 字体)"/>
+          <w:color w:val="404040" w:themeColor="text1" w:themeTint="BF"/>
+          <w:kern w:val="0"/>
+          <w:szCs w:val="24"/>
+          <w:shd w:val="pct5" w:color="auto" w:fill="auto"/>
+        </w:rPr>
+        <w:t>资料</w:t>
       </w:r>
       <w:r>
         <w:rPr>
@@ -377,6 +705,7 @@
         </w:rPr>
         <w:t>"</w:t>
       </w:r>
+      <w:proofErr w:type="gramEnd"/>
       <w:r>
         <w:rPr>
           <w:rFonts w:eastAsia="PingFang SC" w:cs="Times New Roman (正文 CS 字体)"/>
@@ -386,7 +715,73 @@
           <w:shd w:val="pct5" w:color="auto" w:fill="auto"/>
         </w:rPr>
         <w:br/>
-        <w:t xml:space="preserve">where !completed and file.mtime &gt;= date("2022-03-31") - dur(1 week) </w:t>
+        <w:t xml:space="preserve">where !completed and </w:t>
+      </w:r>
+      <w:proofErr w:type="spellStart"/>
+      <w:r>
+        <w:rPr>
+          <w:rFonts w:eastAsia="PingFang SC" w:cs="Times New Roman (正文 CS 字体)"/>
+          <w:color w:val="404040" w:themeColor="text1" w:themeTint="BF"/>
+          <w:kern w:val="0"/>
+          <w:szCs w:val="24"/>
+          <w:shd w:val="pct5" w:color="auto" w:fill="auto"/>
+        </w:rPr>
+        <w:t>file.mtime</w:t>
+      </w:r>
+      <w:proofErr w:type="spellEnd"/>
+      <w:r>
+        <w:rPr>
+          <w:rFonts w:eastAsia="PingFang SC" w:cs="Times New Roman (正文 CS 字体)"/>
+          <w:color w:val="404040" w:themeColor="text1" w:themeTint="BF"/>
+          <w:kern w:val="0"/>
+          <w:szCs w:val="24"/>
+          <w:shd w:val="pct5" w:color="auto" w:fill="auto"/>
+        </w:rPr>
+        <w:t xml:space="preserve"> &gt;= date</w:t>
+      </w:r>
+      <w:proofErr w:type="gramStart"/>
+      <w:r>
+        <w:rPr>
+          <w:rFonts w:eastAsia="PingFang SC" w:cs="Times New Roman (正文 CS 字体)"/>
+          <w:color w:val="404040" w:themeColor="text1" w:themeTint="BF"/>
+          <w:kern w:val="0"/>
+          <w:szCs w:val="24"/>
+          <w:shd w:val="pct5" w:color="auto" w:fill="auto"/>
+        </w:rPr>
+        <w:t>("2022-03-31")</w:t>
+      </w:r>
+      <w:proofErr w:type="gramEnd"/>
+      <w:r>
+        <w:rPr>
+          <w:rFonts w:eastAsia="PingFang SC" w:cs="Times New Roman (正文 CS 字体)"/>
+          <w:color w:val="404040" w:themeColor="text1" w:themeTint="BF"/>
+          <w:kern w:val="0"/>
+          <w:szCs w:val="24"/>
+          <w:shd w:val="pct5" w:color="auto" w:fill="auto"/>
+        </w:rPr>
+        <w:t xml:space="preserve"> - dur</w:t>
+      </w:r>
+      <w:proofErr w:type="gramStart"/>
+      <w:r>
+        <w:rPr>
+          <w:rFonts w:eastAsia="PingFang SC" w:cs="Times New Roman (正文 CS 字体)"/>
+          <w:color w:val="404040" w:themeColor="text1" w:themeTint="BF"/>
+          <w:kern w:val="0"/>
+          <w:szCs w:val="24"/>
+          <w:shd w:val="pct5" w:color="auto" w:fill="auto"/>
+        </w:rPr>
+        <w:t>(1 week)</w:t>
+      </w:r>
+      <w:proofErr w:type="gramEnd"/>
+      <w:r>
+        <w:rPr>
+          <w:rFonts w:eastAsia="PingFang SC" w:cs="Times New Roman (正文 CS 字体)"/>
+          <w:color w:val="404040" w:themeColor="text1" w:themeTint="BF"/>
+          <w:kern w:val="0"/>
+          <w:szCs w:val="24"/>
+          <w:shd w:val="pct5" w:color="auto" w:fill="auto"/>
+        </w:rPr>
+        <w:t xml:space="preserve"> </w:t>
       </w:r>
       <w:r>
         <w:rPr>
@@ -397,7 +792,29 @@
           <w:shd w:val="pct5" w:color="auto" w:fill="auto"/>
         </w:rPr>
         <w:br/>
-        <w:t>sort file.mtime desc</w:t>
+        <w:t xml:space="preserve">sort </w:t>
+      </w:r>
+      <w:proofErr w:type="spellStart"/>
+      <w:r>
+        <w:rPr>
+          <w:rFonts w:eastAsia="PingFang SC" w:cs="Times New Roman (正文 CS 字体)"/>
+          <w:color w:val="404040" w:themeColor="text1" w:themeTint="BF"/>
+          <w:kern w:val="0"/>
+          <w:szCs w:val="24"/>
+          <w:shd w:val="pct5" w:color="auto" w:fill="auto"/>
+        </w:rPr>
+        <w:t>file.mtime</w:t>
+      </w:r>
+      <w:proofErr w:type="spellEnd"/>
+      <w:r>
+        <w:rPr>
+          <w:rFonts w:eastAsia="PingFang SC" w:cs="Times New Roman (正文 CS 字体)"/>
+          <w:color w:val="404040" w:themeColor="text1" w:themeTint="BF"/>
+          <w:kern w:val="0"/>
+          <w:szCs w:val="24"/>
+          <w:shd w:val="pct5" w:color="auto" w:fill="auto"/>
+        </w:rPr>
+        <w:t xml:space="preserve"> desc</w:t>
       </w:r>
     </w:p>
     <w:p>
@@ -442,8 +859,78 @@
           <w:szCs w:val="24"/>
           <w:shd w:val="pct5" w:color="auto" w:fill="auto"/>
         </w:rPr>
-        <w:t>table file.path as path,file.mtime as mtime</w:t>
-      </w:r>
+        <w:t xml:space="preserve">table </w:t>
+      </w:r>
+      <w:proofErr w:type="spellStart"/>
+      <w:proofErr w:type="gramStart"/>
+      <w:r>
+        <w:rPr>
+          <w:rFonts w:eastAsia="PingFang SC" w:cs="Times New Roman (正文 CS 字体)"/>
+          <w:color w:val="404040" w:themeColor="text1" w:themeTint="BF"/>
+          <w:kern w:val="0"/>
+          <w:szCs w:val="24"/>
+          <w:shd w:val="pct5" w:color="auto" w:fill="auto"/>
+        </w:rPr>
+        <w:t>file.path</w:t>
+      </w:r>
+      <w:proofErr w:type="spellEnd"/>
+      <w:proofErr w:type="gramEnd"/>
+      <w:r>
+        <w:rPr>
+          <w:rFonts w:eastAsia="PingFang SC" w:cs="Times New Roman (正文 CS 字体)"/>
+          <w:color w:val="404040" w:themeColor="text1" w:themeTint="BF"/>
+          <w:kern w:val="0"/>
+          <w:szCs w:val="24"/>
+          <w:shd w:val="pct5" w:color="auto" w:fill="auto"/>
+        </w:rPr>
+        <w:t xml:space="preserve"> as </w:t>
+      </w:r>
+      <w:proofErr w:type="spellStart"/>
+      <w:proofErr w:type="gramStart"/>
+      <w:r>
+        <w:rPr>
+          <w:rFonts w:eastAsia="PingFang SC" w:cs="Times New Roman (正文 CS 字体)"/>
+          <w:color w:val="404040" w:themeColor="text1" w:themeTint="BF"/>
+          <w:kern w:val="0"/>
+          <w:szCs w:val="24"/>
+          <w:shd w:val="pct5" w:color="auto" w:fill="auto"/>
+        </w:rPr>
+        <w:t>path,file</w:t>
+      </w:r>
+      <w:proofErr w:type="gramEnd"/>
+      <w:r>
+        <w:rPr>
+          <w:rFonts w:eastAsia="PingFang SC" w:cs="Times New Roman (正文 CS 字体)"/>
+          <w:color w:val="404040" w:themeColor="text1" w:themeTint="BF"/>
+          <w:kern w:val="0"/>
+          <w:szCs w:val="24"/>
+          <w:shd w:val="pct5" w:color="auto" w:fill="auto"/>
+        </w:rPr>
+        <w:t>.mtime</w:t>
+      </w:r>
+      <w:proofErr w:type="spellEnd"/>
+      <w:r>
+        <w:rPr>
+          <w:rFonts w:eastAsia="PingFang SC" w:cs="Times New Roman (正文 CS 字体)"/>
+          <w:color w:val="404040" w:themeColor="text1" w:themeTint="BF"/>
+          <w:kern w:val="0"/>
+          <w:szCs w:val="24"/>
+          <w:shd w:val="pct5" w:color="auto" w:fill="auto"/>
+        </w:rPr>
+        <w:t xml:space="preserve"> as </w:t>
+      </w:r>
+      <w:proofErr w:type="spellStart"/>
+      <w:r>
+        <w:rPr>
+          <w:rFonts w:eastAsia="PingFang SC" w:cs="Times New Roman (正文 CS 字体)"/>
+          <w:color w:val="404040" w:themeColor="text1" w:themeTint="BF"/>
+          <w:kern w:val="0"/>
+          <w:szCs w:val="24"/>
+          <w:shd w:val="pct5" w:color="auto" w:fill="auto"/>
+        </w:rPr>
+        <w:t>mtime</w:t>
+      </w:r>
+      <w:proofErr w:type="spellEnd"/>
       <w:r>
         <w:rPr>
           <w:rFonts w:eastAsia="PingFang SC" w:cs="Times New Roman (正文 CS 字体)"/>
@@ -464,7 +951,31 @@
           <w:shd w:val="pct5" w:color="auto" w:fill="auto"/>
         </w:rPr>
         <w:br/>
-        <w:t>sort file.mtime desc</w:t>
+        <w:t xml:space="preserve">sort </w:t>
+      </w:r>
+      <w:proofErr w:type="spellStart"/>
+      <w:proofErr w:type="gramStart"/>
+      <w:r>
+        <w:rPr>
+          <w:rFonts w:eastAsia="PingFang SC" w:cs="Times New Roman (正文 CS 字体)"/>
+          <w:color w:val="404040" w:themeColor="text1" w:themeTint="BF"/>
+          <w:kern w:val="0"/>
+          <w:szCs w:val="24"/>
+          <w:shd w:val="pct5" w:color="auto" w:fill="auto"/>
+        </w:rPr>
+        <w:t>file.mtime</w:t>
+      </w:r>
+      <w:proofErr w:type="spellEnd"/>
+      <w:proofErr w:type="gramEnd"/>
+      <w:r>
+        <w:rPr>
+          <w:rFonts w:eastAsia="PingFang SC" w:cs="Times New Roman (正文 CS 字体)"/>
+          <w:color w:val="404040" w:themeColor="text1" w:themeTint="BF"/>
+          <w:kern w:val="0"/>
+          <w:szCs w:val="24"/>
+          <w:shd w:val="pct5" w:color="auto" w:fill="auto"/>
+        </w:rPr>
+        <w:t xml:space="preserve"> desc</w:t>
       </w:r>
     </w:p>
     <w:p>
@@ -509,7 +1020,29 @@
           <w:szCs w:val="24"/>
           <w:shd w:val="pct5" w:color="auto" w:fill="auto"/>
         </w:rPr>
-        <w:t>task from -"00.</w:t>
+        <w:t>task from -</w:t>
+      </w:r>
+      <w:proofErr w:type="gramStart"/>
+      <w:r>
+        <w:rPr>
+          <w:rFonts w:eastAsia="PingFang SC" w:cs="Times New Roman (正文 CS 字体)"/>
+          <w:color w:val="404040" w:themeColor="text1" w:themeTint="BF"/>
+          <w:kern w:val="0"/>
+          <w:szCs w:val="24"/>
+          <w:shd w:val="pct5" w:color="auto" w:fill="auto"/>
+        </w:rPr>
+        <w:t>"00</w:t>
+      </w:r>
+      <w:proofErr w:type="gramEnd"/>
+      <w:r>
+        <w:rPr>
+          <w:rFonts w:eastAsia="PingFang SC" w:cs="Times New Roman (正文 CS 字体)"/>
+          <w:color w:val="404040" w:themeColor="text1" w:themeTint="BF"/>
+          <w:kern w:val="0"/>
+          <w:szCs w:val="24"/>
+          <w:shd w:val="pct5" w:color="auto" w:fill="auto"/>
+        </w:rPr>
+        <w:t>.</w:t>
       </w:r>
       <w:r>
         <w:rPr>
@@ -529,7 +1062,18 @@
           <w:szCs w:val="24"/>
           <w:shd w:val="pct5" w:color="auto" w:fill="auto"/>
         </w:rPr>
-        <w:t>/checklist" and -"</w:t>
+        <w:t>/checklist" and -</w:t>
+      </w:r>
+      <w:proofErr w:type="gramStart"/>
+      <w:r>
+        <w:rPr>
+          <w:rFonts w:eastAsia="PingFang SC" w:cs="Times New Roman (正文 CS 字体)"/>
+          <w:color w:val="404040" w:themeColor="text1" w:themeTint="BF"/>
+          <w:kern w:val="0"/>
+          <w:szCs w:val="24"/>
+          <w:shd w:val="pct5" w:color="auto" w:fill="auto"/>
+        </w:rPr>
+        <w:t>"</w:t>
       </w:r>
       <w:r>
         <w:rPr>
@@ -549,7 +1093,29 @@
           <w:szCs w:val="24"/>
           <w:shd w:val="pct5" w:color="auto" w:fill="auto"/>
         </w:rPr>
-        <w:t>" and -"</w:t>
+        <w:t>"</w:t>
+      </w:r>
+      <w:proofErr w:type="gramEnd"/>
+      <w:r>
+        <w:rPr>
+          <w:rFonts w:eastAsia="PingFang SC" w:cs="Times New Roman (正文 CS 字体)"/>
+          <w:color w:val="404040" w:themeColor="text1" w:themeTint="BF"/>
+          <w:kern w:val="0"/>
+          <w:szCs w:val="24"/>
+          <w:shd w:val="pct5" w:color="auto" w:fill="auto"/>
+        </w:rPr>
+        <w:t xml:space="preserve"> and -</w:t>
+      </w:r>
+      <w:proofErr w:type="gramStart"/>
+      <w:r>
+        <w:rPr>
+          <w:rFonts w:eastAsia="PingFang SC" w:cs="Times New Roman (正文 CS 字体)"/>
+          <w:color w:val="404040" w:themeColor="text1" w:themeTint="BF"/>
+          <w:kern w:val="0"/>
+          <w:szCs w:val="24"/>
+          <w:shd w:val="pct5" w:color="auto" w:fill="auto"/>
+        </w:rPr>
+        <w:t>"</w:t>
       </w:r>
       <w:r>
         <w:rPr>
@@ -569,7 +1135,40 @@
           <w:szCs w:val="24"/>
           <w:shd w:val="pct5" w:color="auto" w:fill="auto"/>
         </w:rPr>
-        <w:t>" and -"01.</w:t>
+        <w:t>"</w:t>
+      </w:r>
+      <w:proofErr w:type="gramEnd"/>
+      <w:r>
+        <w:rPr>
+          <w:rFonts w:eastAsia="PingFang SC" w:cs="Times New Roman (正文 CS 字体)"/>
+          <w:color w:val="404040" w:themeColor="text1" w:themeTint="BF"/>
+          <w:kern w:val="0"/>
+          <w:szCs w:val="24"/>
+          <w:shd w:val="pct5" w:color="auto" w:fill="auto"/>
+        </w:rPr>
+        <w:t xml:space="preserve"> and -</w:t>
+      </w:r>
+      <w:proofErr w:type="gramStart"/>
+      <w:r>
+        <w:rPr>
+          <w:rFonts w:eastAsia="PingFang SC" w:cs="Times New Roman (正文 CS 字体)"/>
+          <w:color w:val="404040" w:themeColor="text1" w:themeTint="BF"/>
+          <w:kern w:val="0"/>
+          <w:szCs w:val="24"/>
+          <w:shd w:val="pct5" w:color="auto" w:fill="auto"/>
+        </w:rPr>
+        <w:t>"01</w:t>
+      </w:r>
+      <w:proofErr w:type="gramEnd"/>
+      <w:r>
+        <w:rPr>
+          <w:rFonts w:eastAsia="PingFang SC" w:cs="Times New Roman (正文 CS 字体)"/>
+          <w:color w:val="404040" w:themeColor="text1" w:themeTint="BF"/>
+          <w:kern w:val="0"/>
+          <w:szCs w:val="24"/>
+          <w:shd w:val="pct5" w:color="auto" w:fill="auto"/>
+        </w:rPr>
+        <w:t>.</w:t>
       </w:r>
       <w:r>
         <w:rPr>
@@ -591,6 +1190,7 @@
         </w:rPr>
         <w:t>/</w:t>
       </w:r>
+      <w:proofErr w:type="gramStart"/>
       <w:r>
         <w:rPr>
           <w:rFonts w:eastAsia="PingFang SC" w:cs="Times New Roman (正文 CS 字体)"/>
@@ -609,7 +1209,40 @@
           <w:szCs w:val="24"/>
           <w:shd w:val="pct5" w:color="auto" w:fill="auto"/>
         </w:rPr>
-        <w:t>" and -"01.</w:t>
+        <w:t>"</w:t>
+      </w:r>
+      <w:proofErr w:type="gramEnd"/>
+      <w:r>
+        <w:rPr>
+          <w:rFonts w:eastAsia="PingFang SC" w:cs="Times New Roman (正文 CS 字体)"/>
+          <w:color w:val="404040" w:themeColor="text1" w:themeTint="BF"/>
+          <w:kern w:val="0"/>
+          <w:szCs w:val="24"/>
+          <w:shd w:val="pct5" w:color="auto" w:fill="auto"/>
+        </w:rPr>
+        <w:t xml:space="preserve"> and -</w:t>
+      </w:r>
+      <w:proofErr w:type="gramStart"/>
+      <w:r>
+        <w:rPr>
+          <w:rFonts w:eastAsia="PingFang SC" w:cs="Times New Roman (正文 CS 字体)"/>
+          <w:color w:val="404040" w:themeColor="text1" w:themeTint="BF"/>
+          <w:kern w:val="0"/>
+          <w:szCs w:val="24"/>
+          <w:shd w:val="pct5" w:color="auto" w:fill="auto"/>
+        </w:rPr>
+        <w:t>"01</w:t>
+      </w:r>
+      <w:proofErr w:type="gramEnd"/>
+      <w:r>
+        <w:rPr>
+          <w:rFonts w:eastAsia="PingFang SC" w:cs="Times New Roman (正文 CS 字体)"/>
+          <w:color w:val="404040" w:themeColor="text1" w:themeTint="BF"/>
+          <w:kern w:val="0"/>
+          <w:szCs w:val="24"/>
+          <w:shd w:val="pct5" w:color="auto" w:fill="auto"/>
+        </w:rPr>
+        <w:t>.</w:t>
       </w:r>
       <w:r>
         <w:rPr>
@@ -639,7 +1272,18 @@
           <w:szCs w:val="24"/>
           <w:shd w:val="pct5" w:color="auto" w:fill="auto"/>
         </w:rPr>
-        <w:t>工作资料</w:t>
+        <w:t>工作</w:t>
+      </w:r>
+      <w:proofErr w:type="gramStart"/>
+      <w:r>
+        <w:rPr>
+          <w:rFonts w:eastAsia="PingFang SC" w:cs="Times New Roman (正文 CS 字体)"/>
+          <w:color w:val="404040" w:themeColor="text1" w:themeTint="BF"/>
+          <w:kern w:val="0"/>
+          <w:szCs w:val="24"/>
+          <w:shd w:val="pct5" w:color="auto" w:fill="auto"/>
+        </w:rPr>
+        <w:t>资料</w:t>
       </w:r>
       <w:r>
         <w:rPr>
@@ -651,6 +1295,7 @@
         </w:rPr>
         <w:t>"</w:t>
       </w:r>
+      <w:proofErr w:type="gramEnd"/>
       <w:r>
         <w:rPr>
           <w:rFonts w:eastAsia="PingFang SC" w:cs="Times New Roman (正文 CS 字体)"/>
@@ -660,7 +1305,73 @@
           <w:shd w:val="pct5" w:color="auto" w:fill="auto"/>
         </w:rPr>
         <w:br/>
-        <w:t xml:space="preserve">where completed and file.mtime &gt;= date("2022-03-31") - dur(1 week) </w:t>
+        <w:t xml:space="preserve">where completed and </w:t>
+      </w:r>
+      <w:proofErr w:type="spellStart"/>
+      <w:r>
+        <w:rPr>
+          <w:rFonts w:eastAsia="PingFang SC" w:cs="Times New Roman (正文 CS 字体)"/>
+          <w:color w:val="404040" w:themeColor="text1" w:themeTint="BF"/>
+          <w:kern w:val="0"/>
+          <w:szCs w:val="24"/>
+          <w:shd w:val="pct5" w:color="auto" w:fill="auto"/>
+        </w:rPr>
+        <w:t>file.mtime</w:t>
+      </w:r>
+      <w:proofErr w:type="spellEnd"/>
+      <w:r>
+        <w:rPr>
+          <w:rFonts w:eastAsia="PingFang SC" w:cs="Times New Roman (正文 CS 字体)"/>
+          <w:color w:val="404040" w:themeColor="text1" w:themeTint="BF"/>
+          <w:kern w:val="0"/>
+          <w:szCs w:val="24"/>
+          <w:shd w:val="pct5" w:color="auto" w:fill="auto"/>
+        </w:rPr>
+        <w:t xml:space="preserve"> &gt;= date</w:t>
+      </w:r>
+      <w:proofErr w:type="gramStart"/>
+      <w:r>
+        <w:rPr>
+          <w:rFonts w:eastAsia="PingFang SC" w:cs="Times New Roman (正文 CS 字体)"/>
+          <w:color w:val="404040" w:themeColor="text1" w:themeTint="BF"/>
+          <w:kern w:val="0"/>
+          <w:szCs w:val="24"/>
+          <w:shd w:val="pct5" w:color="auto" w:fill="auto"/>
+        </w:rPr>
+        <w:t>("2022-03-31")</w:t>
+      </w:r>
+      <w:proofErr w:type="gramEnd"/>
+      <w:r>
+        <w:rPr>
+          <w:rFonts w:eastAsia="PingFang SC" w:cs="Times New Roman (正文 CS 字体)"/>
+          <w:color w:val="404040" w:themeColor="text1" w:themeTint="BF"/>
+          <w:kern w:val="0"/>
+          <w:szCs w:val="24"/>
+          <w:shd w:val="pct5" w:color="auto" w:fill="auto"/>
+        </w:rPr>
+        <w:t xml:space="preserve"> - dur</w:t>
+      </w:r>
+      <w:proofErr w:type="gramStart"/>
+      <w:r>
+        <w:rPr>
+          <w:rFonts w:eastAsia="PingFang SC" w:cs="Times New Roman (正文 CS 字体)"/>
+          <w:color w:val="404040" w:themeColor="text1" w:themeTint="BF"/>
+          <w:kern w:val="0"/>
+          <w:szCs w:val="24"/>
+          <w:shd w:val="pct5" w:color="auto" w:fill="auto"/>
+        </w:rPr>
+        <w:t>(1 week)</w:t>
+      </w:r>
+      <w:proofErr w:type="gramEnd"/>
+      <w:r>
+        <w:rPr>
+          <w:rFonts w:eastAsia="PingFang SC" w:cs="Times New Roman (正文 CS 字体)"/>
+          <w:color w:val="404040" w:themeColor="text1" w:themeTint="BF"/>
+          <w:kern w:val="0"/>
+          <w:szCs w:val="24"/>
+          <w:shd w:val="pct5" w:color="auto" w:fill="auto"/>
+        </w:rPr>
+        <w:t xml:space="preserve"> </w:t>
       </w:r>
       <w:r>
         <w:rPr>
@@ -671,7 +1382,29 @@
           <w:shd w:val="pct5" w:color="auto" w:fill="auto"/>
         </w:rPr>
         <w:br/>
-        <w:t>sort file.ctime desc</w:t>
+        <w:t xml:space="preserve">sort </w:t>
+      </w:r>
+      <w:proofErr w:type="spellStart"/>
+      <w:r>
+        <w:rPr>
+          <w:rFonts w:eastAsia="PingFang SC" w:cs="Times New Roman (正文 CS 字体)"/>
+          <w:color w:val="404040" w:themeColor="text1" w:themeTint="BF"/>
+          <w:kern w:val="0"/>
+          <w:szCs w:val="24"/>
+          <w:shd w:val="pct5" w:color="auto" w:fill="auto"/>
+        </w:rPr>
+        <w:t>file.ctime</w:t>
+      </w:r>
+      <w:proofErr w:type="spellEnd"/>
+      <w:r>
+        <w:rPr>
+          <w:rFonts w:eastAsia="PingFang SC" w:cs="Times New Roman (正文 CS 字体)"/>
+          <w:color w:val="404040" w:themeColor="text1" w:themeTint="BF"/>
+          <w:kern w:val="0"/>
+          <w:szCs w:val="24"/>
+          <w:shd w:val="pct5" w:color="auto" w:fill="auto"/>
+        </w:rPr>
+        <w:t xml:space="preserve"> desc</w:t>
       </w:r>
     </w:p>
     <w:p>
@@ -727,19 +1460,85 @@
           <w:shd w:val="pct5" w:color="auto" w:fill="auto"/>
         </w:rPr>
         <w:br/>
-        <w:t xml:space="preserve">WHERE file.mtime &gt;= date("2022-03-31") - dur(1 day)  </w:t>
+        <w:t xml:space="preserve">WHERE </w:t>
+      </w:r>
+      <w:proofErr w:type="spellStart"/>
+      <w:proofErr w:type="gramStart"/>
+      <w:r>
+        <w:rPr>
+          <w:rFonts w:eastAsia="PingFang SC" w:cs="Times New Roman (正文 CS 字体)"/>
+          <w:color w:val="404040" w:themeColor="text1" w:themeTint="BF"/>
+          <w:kern w:val="0"/>
+          <w:szCs w:val="24"/>
+          <w:shd w:val="pct5" w:color="auto" w:fill="auto"/>
+        </w:rPr>
+        <w:t>file.mtime</w:t>
+      </w:r>
+      <w:proofErr w:type="spellEnd"/>
+      <w:proofErr w:type="gramEnd"/>
+      <w:r>
+        <w:rPr>
+          <w:rFonts w:eastAsia="PingFang SC" w:cs="Times New Roman (正文 CS 字体)"/>
+          <w:color w:val="404040" w:themeColor="text1" w:themeTint="BF"/>
+          <w:kern w:val="0"/>
+          <w:szCs w:val="24"/>
+          <w:shd w:val="pct5" w:color="auto" w:fill="auto"/>
+        </w:rPr>
+        <w:t xml:space="preserve"> &gt;= </w:t>
+      </w:r>
+      <w:proofErr w:type="gramStart"/>
+      <w:r>
+        <w:rPr>
+          <w:rFonts w:eastAsia="PingFang SC" w:cs="Times New Roman (正文 CS 字体)"/>
+          <w:color w:val="404040" w:themeColor="text1" w:themeTint="BF"/>
+          <w:kern w:val="0"/>
+          <w:szCs w:val="24"/>
+          <w:shd w:val="pct5" w:color="auto" w:fill="auto"/>
+        </w:rPr>
+        <w:t>date(</w:t>
+      </w:r>
+      <w:proofErr w:type="gramEnd"/>
+      <w:r>
+        <w:rPr>
+          <w:rFonts w:eastAsia="PingFang SC" w:cs="Times New Roman (正文 CS 字体)"/>
+          <w:color w:val="404040" w:themeColor="text1" w:themeTint="BF"/>
+          <w:kern w:val="0"/>
+          <w:szCs w:val="24"/>
+          <w:shd w:val="pct5" w:color="auto" w:fill="auto"/>
+        </w:rPr>
+        <w:t xml:space="preserve">"2022-03-31") - </w:t>
+      </w:r>
+      <w:proofErr w:type="gramStart"/>
+      <w:r>
+        <w:rPr>
+          <w:rFonts w:eastAsia="PingFang SC" w:cs="Times New Roman (正文 CS 字体)"/>
+          <w:color w:val="404040" w:themeColor="text1" w:themeTint="BF"/>
+          <w:kern w:val="0"/>
+          <w:szCs w:val="24"/>
+          <w:shd w:val="pct5" w:color="auto" w:fill="auto"/>
+        </w:rPr>
+        <w:t>dur(</w:t>
+      </w:r>
+      <w:proofErr w:type="gramEnd"/>
+      <w:r>
+        <w:rPr>
+          <w:rFonts w:eastAsia="PingFang SC" w:cs="Times New Roman (正文 CS 字体)"/>
+          <w:color w:val="404040" w:themeColor="text1" w:themeTint="BF"/>
+          <w:kern w:val="0"/>
+          <w:szCs w:val="24"/>
+          <w:shd w:val="pct5" w:color="auto" w:fill="auto"/>
+        </w:rPr>
+        <w:t xml:space="preserve">1 day)  </w:t>
       </w:r>
     </w:p>
     <w:bookmarkEnd w:id="0"/>
     <w:bookmarkEnd w:id="7"/>
     <w:p/>
     <w:sectPr>
-      <w:headerReference w:type="even" r:id="rId7"/>
-      <w:headerReference w:type="default" r:id="rId8"/>
-      <w:footerReference w:type="even" r:id="rId9"/>
-      <w:footerReference w:type="default" r:id="rId10"/>
-      <w:headerReference w:type="first" r:id="rId11"/>
-      <w:footerReference w:type="first" r:id="rId12"/>
+      <w:headerReference w:type="default" r:id="rId7"/>
+      <w:footerReference w:type="default" r:id="rId8"/>
+      <w:headerReference w:type="first" r:id="rId9"/>
+      <w:footerReference w:type="first" r:id="rId10"/>
       <w:pgSz w:w="11906" w:h="16838"/>
       <w:pgMar w:top="1440" w:right="1800" w:bottom="1440" w:left="1800" w:header="454" w:footer="567" w:gutter="0"/>
       <w:cols w:space="425"/>
@@ -770,295 +1569,6 @@
 </file>
 
 <file path=word/footer1.xml><?xml version="1.0" encoding="utf-8"?>
-<w:ftr xmlns:wpc="http://schemas.microsoft.com/office/word/2010/wordprocessingCanvas" xmlns:cx="http://schemas.microsoft.com/office/drawing/2014/chartex" xmlns:cx1="http://schemas.microsoft.com/office/drawing/2015/9/8/chartex" xmlns:cx2="http://schemas.microsoft.com/office/drawing/2015/10/21/chartex" xmlns:cx3="http://schemas.microsoft.com/office/drawing/2016/5/9/chartex" xmlns:cx4="http://schemas.microsoft.com/office/drawing/2016/5/10/chartex" xmlns:cx5="http://schemas.microsoft.com/office/drawing/2016/5/11/chartex" xmlns:cx6="http://schemas.microsoft.com/office/drawing/2016/5/12/chartex" xmlns:cx7="http://schemas.microsoft.com/office/drawing/2016/5/13/chartex" xmlns:cx8="http://schemas.microsoft.com/office/drawing/2016/5/14/chartex" xmlns:mc="http://schemas.openxmlformats.org/markup-compatibility/2006" xmlns:aink="http://schemas.microsoft.com/office/drawing/2016/ink" xmlns:am3d="http://schemas.microsoft.com/office/drawing/2017/model3d" xmlns:o="urn:schemas-microsoft-com:office:office" xmlns:oel="http://schemas.microsoft.com/office/2019/extlst" xmlns:r="http://schemas.openxmlformats.org/officeDocument/2006/relationships" xmlns:m="http://schemas.openxmlformats.org/officeDocument/2006/math" xmlns:v="urn:schemas-microsoft-com:vml" xmlns:wp14="http://schemas.microsoft.com/office/word/2010/wordprocessingDrawing" xmlns:wp="http://schemas.openxmlformats.org/drawingml/2006/wordprocessingDrawing" xmlns:w10="urn:schemas-microsoft-com:office:word" xmlns:w="http://schemas.openxmlformats.org/wordprocessingml/2006/main" xmlns:w14="http://schemas.microsoft.com/office/word/2010/wordml" xmlns:w15="http://schemas.microsoft.com/office/word/2012/wordml" xmlns:w16cex="http://schemas.microsoft.com/office/word/2018/wordml/cex" xmlns:w16cid="http://schemas.microsoft.com/office/word/2016/wordml/cid" xmlns:w16="http://schemas.microsoft.com/office/word/2018/wordml" xmlns:w16du="http://schemas.microsoft.com/office/word/2023/wordml/word16du" xmlns:w16sdtdh="http://schemas.microsoft.com/office/word/2020/wordml/sdtdatahash" xmlns:w16sdtfl="http://schemas.microsoft.com/office/word/2024/wordml/sdtformatlock" xmlns:w16se="http://schemas.microsoft.com/office/word/2015/wordml/symex" xmlns:wpg="http://schemas.microsoft.com/office/word/2010/wordprocessingGroup" xmlns:wpi="http://schemas.microsoft.com/office/word/2010/wordprocessingInk" xmlns:wne="http://schemas.microsoft.com/office/word/2006/wordml" xmlns:wps="http://schemas.microsoft.com/office/word/2010/wordprocessingShape" mc:Ignorable="w14 w15 w16se w16cid w16 w16cex w16sdtdh w16sdtfl w16du wp14">
-  <w:p>
-    <w:pPr>
-      <w:pStyle w:val="a7"/>
-    </w:pPr>
-  </w:p>
-</w:ftr>
-</file>
-
-<file path=word/footer2.xml><?xml version="1.0" encoding="utf-8"?>
-<w:ftr xmlns:wpc="http://schemas.microsoft.com/office/word/2010/wordprocessingCanvas" xmlns:cx="http://schemas.microsoft.com/office/drawing/2014/chartex" xmlns:cx1="http://schemas.microsoft.com/office/drawing/2015/9/8/chartex" xmlns:cx2="http://schemas.microsoft.com/office/drawing/2015/10/21/chartex" xmlns:cx3="http://schemas.microsoft.com/office/drawing/2016/5/9/chartex" xmlns:cx4="http://schemas.microsoft.com/office/drawing/2016/5/10/chartex" xmlns:cx5="http://schemas.microsoft.com/office/drawing/2016/5/11/chartex" xmlns:cx6="http://schemas.microsoft.com/office/drawing/2016/5/12/chartex" xmlns:cx7="http://schemas.microsoft.com/office/drawing/2016/5/13/chartex" xmlns:cx8="http://schemas.microsoft.com/office/drawing/2016/5/14/chartex" xmlns:mc="http://schemas.openxmlformats.org/markup-compatibility/2006" xmlns:aink="http://schemas.microsoft.com/office/drawing/2016/ink" xmlns:am3d="http://schemas.microsoft.com/office/drawing/2017/model3d" xmlns:o="urn:schemas-microsoft-com:office:office" xmlns:oel="http://schemas.microsoft.com/office/2019/extlst" xmlns:r="http://schemas.openxmlformats.org/officeDocument/2006/relationships" xmlns:m="http://schemas.openxmlformats.org/officeDocument/2006/math" xmlns:v="urn:schemas-microsoft-com:vml" xmlns:wp14="http://schemas.microsoft.com/office/word/2010/wordprocessingDrawing" xmlns:wp="http://schemas.openxmlformats.org/drawingml/2006/wordprocessingDrawing" xmlns:w10="urn:schemas-microsoft-com:office:word" xmlns:w="http://schemas.openxmlformats.org/wordprocessingml/2006/main" xmlns:w14="http://schemas.microsoft.com/office/word/2010/wordml" xmlns:w15="http://schemas.microsoft.com/office/word/2012/wordml" xmlns:w16cex="http://schemas.microsoft.com/office/word/2018/wordml/cex" xmlns:w16cid="http://schemas.microsoft.com/office/word/2016/wordml/cid" xmlns:w16="http://schemas.microsoft.com/office/word/2018/wordml" xmlns:w16du="http://schemas.microsoft.com/office/word/2023/wordml/word16du" xmlns:w16sdtdh="http://schemas.microsoft.com/office/word/2020/wordml/sdtdatahash" xmlns:w16sdtfl="http://schemas.microsoft.com/office/word/2024/wordml/sdtformatlock" xmlns:w16se="http://schemas.microsoft.com/office/word/2015/wordml/symex" xmlns:wpg="http://schemas.microsoft.com/office/word/2010/wordprocessingGroup" xmlns:wpi="http://schemas.microsoft.com/office/word/2010/wordprocessingInk" xmlns:wne="http://schemas.microsoft.com/office/word/2006/wordml" xmlns:wps="http://schemas.microsoft.com/office/word/2010/wordprocessingShape" mc:Ignorable="w14 w15 w16se w16cid w16 w16cex w16sdtdh w16sdtfl w16du wp14">
-  <w:tbl>
-    <w:tblPr>
-      <w:tblStyle w:val="a9"/>
-      <w:tblW w:w="8613" w:type="dxa"/>
-      <w:tblBorders>
-        <w:top w:val="none" w:sz="0" w:space="0" w:color="auto"/>
-        <w:left w:val="none" w:sz="0" w:space="0" w:color="auto"/>
-        <w:bottom w:val="none" w:sz="0" w:space="0" w:color="auto"/>
-        <w:right w:val="none" w:sz="0" w:space="0" w:color="auto"/>
-        <w:insideH w:val="none" w:sz="0" w:space="0" w:color="auto"/>
-        <w:insideV w:val="none" w:sz="0" w:space="0" w:color="auto"/>
-      </w:tblBorders>
-      <w:tblLook w:val="04A0" w:firstRow="1" w:lastRow="0" w:firstColumn="1" w:lastColumn="0" w:noHBand="0" w:noVBand="1"/>
-    </w:tblPr>
-    <w:tblGrid>
-      <w:gridCol w:w="6204"/>
-      <w:gridCol w:w="2409"/>
-    </w:tblGrid>
-    <w:tr>
-      <w:tc>
-        <w:tcPr>
-          <w:tcW w:w="6204" w:type="dxa"/>
-        </w:tcPr>
-        <w:p>
-          <w:pPr>
-            <w:pStyle w:val="a7"/>
-            <w:ind w:right="238"/>
-            <w:rPr>
-              <w:sz w:val="21"/>
-              <w:lang w:eastAsia="zh-CN"/>
-            </w:rPr>
-          </w:pPr>
-          <w:r>
-            <w:rPr>
-              <w:rFonts w:hint="eastAsia"/>
-              <w:sz w:val="21"/>
-              <w:lang w:eastAsia="zh-CN"/>
-            </w:rPr>
-            <w:t>地址：杭州市余杭区五常街道文一西路</w:t>
-          </w:r>
-          <w:r>
-            <w:rPr>
-              <w:rFonts w:hint="eastAsia"/>
-              <w:sz w:val="21"/>
-              <w:lang w:eastAsia="zh-CN"/>
-            </w:rPr>
-            <w:t>998</w:t>
-          </w:r>
-          <w:r>
-            <w:rPr>
-              <w:rFonts w:hint="eastAsia"/>
-              <w:sz w:val="21"/>
-              <w:lang w:eastAsia="zh-CN"/>
-            </w:rPr>
-            <w:t>号</w:t>
-          </w:r>
-          <w:r>
-            <w:rPr>
-              <w:rFonts w:hint="eastAsia"/>
-              <w:sz w:val="21"/>
-              <w:lang w:eastAsia="zh-CN"/>
-            </w:rPr>
-            <w:t>1</w:t>
-          </w:r>
-          <w:r>
-            <w:rPr>
-              <w:rFonts w:hint="eastAsia"/>
-              <w:sz w:val="21"/>
-              <w:lang w:eastAsia="zh-CN"/>
-            </w:rPr>
-            <w:t>幢</w:t>
-          </w:r>
-          <w:r>
-            <w:rPr>
-              <w:rFonts w:hint="eastAsia"/>
-              <w:sz w:val="21"/>
-              <w:lang w:eastAsia="zh-CN"/>
-            </w:rPr>
-            <w:t>601A</w:t>
-          </w:r>
-          <w:r>
-            <w:rPr>
-              <w:rFonts w:hint="eastAsia"/>
-              <w:sz w:val="21"/>
-              <w:lang w:eastAsia="zh-CN"/>
-            </w:rPr>
-            <w:t>室</w:t>
-          </w:r>
-        </w:p>
-      </w:tc>
-      <w:tc>
-        <w:tcPr>
-          <w:tcW w:w="2409" w:type="dxa"/>
-        </w:tcPr>
-        <w:p>
-          <w:pPr>
-            <w:pStyle w:val="a7"/>
-            <w:ind w:right="238"/>
-            <w:jc w:val="right"/>
-            <w:rPr>
-              <w:sz w:val="21"/>
-              <w:lang w:eastAsia="zh-CN"/>
-            </w:rPr>
-          </w:pPr>
-          <w:r>
-            <w:rPr>
-              <w:sz w:val="21"/>
-              <w:lang w:val="zh-CN" w:eastAsia="zh-CN"/>
-            </w:rPr>
-            <w:t xml:space="preserve"> </w:t>
-          </w:r>
-          <w:r>
-            <w:rPr>
-              <w:b/>
-              <w:bCs/>
-              <w:sz w:val="21"/>
-            </w:rPr>
-            <w:fldChar w:fldCharType="begin"/>
-          </w:r>
-          <w:r>
-            <w:rPr>
-              <w:b/>
-              <w:bCs/>
-              <w:sz w:val="21"/>
-              <w:lang w:eastAsia="zh-CN"/>
-            </w:rPr>
-            <w:instrText>PAGE  \* Arabic  \* MERGEFORMAT</w:instrText>
-          </w:r>
-          <w:r>
-            <w:rPr>
-              <w:b/>
-              <w:bCs/>
-              <w:sz w:val="21"/>
-            </w:rPr>
-            <w:fldChar w:fldCharType="separate"/>
-          </w:r>
-          <w:r>
-            <w:rPr>
-              <w:b/>
-              <w:bCs/>
-              <w:sz w:val="21"/>
-              <w:lang w:val="zh-CN" w:eastAsia="zh-CN"/>
-            </w:rPr>
-            <w:t>1</w:t>
-          </w:r>
-          <w:r>
-            <w:rPr>
-              <w:b/>
-              <w:bCs/>
-              <w:sz w:val="21"/>
-            </w:rPr>
-            <w:fldChar w:fldCharType="end"/>
-          </w:r>
-          <w:r>
-            <w:rPr>
-              <w:sz w:val="21"/>
-              <w:lang w:val="zh-CN" w:eastAsia="zh-CN"/>
-            </w:rPr>
-            <w:t xml:space="preserve"> / </w:t>
-          </w:r>
-          <w:r>
-            <w:rPr>
-              <w:b/>
-              <w:bCs/>
-              <w:sz w:val="21"/>
-            </w:rPr>
-            <w:fldChar w:fldCharType="begin"/>
-          </w:r>
-          <w:r>
-            <w:rPr>
-              <w:b/>
-              <w:bCs/>
-              <w:sz w:val="21"/>
-              <w:lang w:eastAsia="zh-CN"/>
-            </w:rPr>
-            <w:instrText>NUMPAGES  \* Arabic  \* MERGEFORMAT</w:instrText>
-          </w:r>
-          <w:r>
-            <w:rPr>
-              <w:b/>
-              <w:bCs/>
-              <w:sz w:val="21"/>
-            </w:rPr>
-            <w:fldChar w:fldCharType="separate"/>
-          </w:r>
-          <w:r>
-            <w:rPr>
-              <w:b/>
-              <w:bCs/>
-              <w:sz w:val="21"/>
-              <w:lang w:val="zh-CN" w:eastAsia="zh-CN"/>
-            </w:rPr>
-            <w:t>2</w:t>
-          </w:r>
-          <w:r>
-            <w:rPr>
-              <w:b/>
-              <w:bCs/>
-              <w:sz w:val="21"/>
-            </w:rPr>
-            <w:fldChar w:fldCharType="end"/>
-          </w:r>
-        </w:p>
-      </w:tc>
-    </w:tr>
-    <w:tr>
-      <w:tc>
-        <w:tcPr>
-          <w:tcW w:w="6204" w:type="dxa"/>
-        </w:tcPr>
-        <w:p>
-          <w:pPr>
-            <w:pStyle w:val="a7"/>
-            <w:ind w:right="238"/>
-            <w:rPr>
-              <w:sz w:val="21"/>
-              <w:lang w:eastAsia="zh-CN"/>
-            </w:rPr>
-          </w:pPr>
-          <w:r>
-            <w:rPr>
-              <w:rFonts w:hint="eastAsia"/>
-              <w:sz w:val="21"/>
-              <w:lang w:eastAsia="zh-CN"/>
-            </w:rPr>
-            <w:t>周豪靖</w:t>
-          </w:r>
-          <w:r>
-            <w:rPr>
-              <w:rFonts w:hint="eastAsia"/>
-              <w:sz w:val="21"/>
-              <w:lang w:eastAsia="zh-CN"/>
-            </w:rPr>
-            <w:t xml:space="preserve"> 13173678927</w:t>
-          </w:r>
-          <w:r>
-            <w:rPr>
-              <w:sz w:val="21"/>
-              <w:lang w:eastAsia="zh-CN"/>
-            </w:rPr>
-            <w:t xml:space="preserve"> </w:t>
-          </w:r>
-          <w:r>
-            <w:rPr>
-              <w:rFonts w:hint="eastAsia"/>
-              <w:sz w:val="21"/>
-              <w:lang w:eastAsia="zh-CN"/>
-            </w:rPr>
-            <w:t>zhjwork@gmail.com</w:t>
-          </w:r>
-        </w:p>
-      </w:tc>
-      <w:tc>
-        <w:tcPr>
-          <w:tcW w:w="2409" w:type="dxa"/>
-        </w:tcPr>
-        <w:p>
-          <w:pPr>
-            <w:pStyle w:val="a7"/>
-            <w:ind w:right="238"/>
-            <w:rPr>
-              <w:sz w:val="21"/>
-              <w:lang w:eastAsia="zh-CN"/>
-            </w:rPr>
-          </w:pPr>
-        </w:p>
-      </w:tc>
-    </w:tr>
-  </w:tbl>
-  <w:p>
-    <w:pPr>
-      <w:pStyle w:val="a7"/>
-    </w:pPr>
-  </w:p>
-</w:ftr>
-</file>
-
-<file path=word/footer3.xml><?xml version="1.0" encoding="utf-8"?>
 <w:ftr xmlns:wpc="http://schemas.microsoft.com/office/word/2010/wordprocessingCanvas" xmlns:cx="http://schemas.microsoft.com/office/drawing/2014/chartex" xmlns:cx1="http://schemas.microsoft.com/office/drawing/2015/9/8/chartex" xmlns:cx2="http://schemas.microsoft.com/office/drawing/2015/10/21/chartex" xmlns:cx3="http://schemas.microsoft.com/office/drawing/2016/5/9/chartex" xmlns:cx4="http://schemas.microsoft.com/office/drawing/2016/5/10/chartex" xmlns:cx5="http://schemas.microsoft.com/office/drawing/2016/5/11/chartex" xmlns:cx6="http://schemas.microsoft.com/office/drawing/2016/5/12/chartex" xmlns:cx7="http://schemas.microsoft.com/office/drawing/2016/5/13/chartex" xmlns:cx8="http://schemas.microsoft.com/office/drawing/2016/5/14/chartex" xmlns:mc="http://schemas.openxmlformats.org/markup-compatibility/2006" xmlns:aink="http://schemas.microsoft.com/office/drawing/2016/ink" xmlns:am3d="http://schemas.microsoft.com/office/drawing/2017/model3d" xmlns:o="urn:schemas-microsoft-com:office:office" xmlns:oel="http://schemas.microsoft.com/office/2019/extlst" xmlns:r="http://schemas.openxmlformats.org/officeDocument/2006/relationships" xmlns:m="http://schemas.openxmlformats.org/officeDocument/2006/math" xmlns:v="urn:schemas-microsoft-com:vml" xmlns:wp14="http://schemas.microsoft.com/office/word/2010/wordprocessingDrawing" xmlns:wp="http://schemas.openxmlformats.org/drawingml/2006/wordprocessingDrawing" xmlns:w10="urn:schemas-microsoft-com:office:word" xmlns:w="http://schemas.openxmlformats.org/wordprocessingml/2006/main" xmlns:w14="http://schemas.microsoft.com/office/word/2010/wordml" xmlns:w15="http://schemas.microsoft.com/office/word/2012/wordml" xmlns:w16cex="http://schemas.microsoft.com/office/word/2018/wordml/cex" xmlns:w16cid="http://schemas.microsoft.com/office/word/2016/wordml/cid" xmlns:w16="http://schemas.microsoft.com/office/word/2018/wordml" xmlns:w16du="http://schemas.microsoft.com/office/word/2023/wordml/word16du" xmlns:w16sdtdh="http://schemas.microsoft.com/office/word/2020/wordml/sdtdatahash" xmlns:w16sdtfl="http://schemas.microsoft.com/office/word/2024/wordml/sdtformatlock" xmlns:w16se="http://schemas.microsoft.com/office/word/2015/wordml/symex" xmlns:wpg="http://schemas.microsoft.com/office/word/2010/wordprocessingGroup" xmlns:wpi="http://schemas.microsoft.com/office/word/2010/wordprocessingInk" xmlns:wne="http://schemas.microsoft.com/office/word/2006/wordml" xmlns:wps="http://schemas.microsoft.com/office/word/2010/wordprocessingShape" mc:Ignorable="w14 w15 w16se w16cid w16 w16cex w16sdtdh w16sdtfl w16du wp14">
   <w:tbl>
     <w:tblPr>
@@ -1088,7 +1598,6 @@
             <w:pStyle w:val="a7"/>
             <w:ind w:right="238"/>
             <w:rPr>
-              <w:rFonts w:hint="eastAsia"/>
               <w:sz w:val="21"/>
               <w:lang w:eastAsia="zh-CN"/>
             </w:rPr>
@@ -1215,10 +1724,10 @@
           </w:r>
           <w:r>
             <w:rPr>
+              <w:rFonts w:hint="eastAsia"/>
               <w:b/>
               <w:bCs/>
               <w:sz w:val="21"/>
-              <w:lang w:val="zh-CN" w:eastAsia="zh-CN"/>
             </w:rPr>
             <w:t>1</w:t>
           </w:r>
@@ -1264,12 +1773,12 @@
           </w:r>
           <w:r>
             <w:rPr>
+              <w:rFonts w:hint="eastAsia"/>
               <w:b/>
               <w:bCs/>
               <w:sz w:val="21"/>
-              <w:lang w:val="zh-CN" w:eastAsia="zh-CN"/>
-            </w:rPr>
-            <w:t>2</w:t>
+            </w:rPr>
+            <w:t>3</w:t>
           </w:r>
           <w:r>
             <w:rPr>
@@ -1302,18 +1811,106 @@
               <w:sz w:val="21"/>
               <w:lang w:eastAsia="zh-CN"/>
             </w:rPr>
-            <w:t>周豪靖</w:t>
-          </w:r>
+            <w:t>周豪</w:t>
+          </w:r>
+          <w:proofErr w:type="gramStart"/>
           <w:r>
             <w:rPr>
               <w:rFonts w:hint="eastAsia"/>
               <w:sz w:val="21"/>
               <w:lang w:eastAsia="zh-CN"/>
             </w:rPr>
-            <w:t xml:space="preserve"> 13173678927</w:t>
-          </w:r>
-          <w:r>
-            <w:rPr>
+            <w:t>靖</w:t>
+          </w:r>
+          <w:r>
+            <w:rPr>
+              <w:rFonts w:hint="eastAsia"/>
+              <w:sz w:val="21"/>
+              <w:lang w:eastAsia="zh-CN"/>
+            </w:rPr>
+            <w:t xml:space="preserve"> </w:t>
+          </w:r>
+          <w:r>
+            <w:rPr>
+              <mc:AlternateContent>
+                <mc:Choice Requires="w16se">
+                  <w:rFonts w:hint="eastAsia"/>
+                </mc:Choice>
+                <mc:Fallback>
+                  <w:rFonts w:ascii="Segoe UI Emoji" w:eastAsia="Segoe UI Emoji" w:hAnsi="Segoe UI Emoji" w:cs="Segoe UI Emoji"/>
+                </mc:Fallback>
+              </mc:AlternateContent>
+              <w:sz w:val="21"/>
+              <w:lang w:eastAsia="zh-CN"/>
+            </w:rPr>
+            <mc:AlternateContent>
+              <mc:Choice Requires="w16se">
+                <w16se:symEx w16se:font="Segoe UI Emoji" w16se:char="260E"/>
+              </mc:Choice>
+              <mc:Fallback>
+                <w:t>☎</w:t>
+              </mc:Fallback>
+            </mc:AlternateContent>
+          </w:r>
+          <w:proofErr w:type="gramEnd"/>
+          <w:r>
+            <w:rPr>
+              <w:rFonts w:hint="eastAsia"/>
+              <w:sz w:val="21"/>
+              <w:lang w:eastAsia="zh-CN"/>
+            </w:rPr>
+            <w:t xml:space="preserve">️ </w:t>
+          </w:r>
+          <w:proofErr w:type="gramStart"/>
+          <w:r>
+            <w:rPr>
+              <w:rFonts w:hint="eastAsia"/>
+              <w:sz w:val="21"/>
+              <w:lang w:eastAsia="zh-CN"/>
+            </w:rPr>
+            <w:t>13173678927</w:t>
+          </w:r>
+          <w:r>
+            <w:rPr>
+              <w:sz w:val="21"/>
+              <w:lang w:eastAsia="zh-CN"/>
+            </w:rPr>
+            <w:t xml:space="preserve"> </w:t>
+          </w:r>
+          <w:r>
+            <w:rPr>
+              <w:rFonts w:hint="eastAsia"/>
+              <w:sz w:val="21"/>
+              <w:lang w:eastAsia="zh-CN"/>
+            </w:rPr>
+            <w:t xml:space="preserve"> </w:t>
+          </w:r>
+          <w:r>
+            <w:rPr>
+              <mc:AlternateContent>
+                <mc:Choice Requires="w16se">
+                  <w:rFonts w:hint="eastAsia"/>
+                </mc:Choice>
+                <mc:Fallback>
+                  <w:rFonts w:ascii="Segoe UI Emoji" w:eastAsia="Segoe UI Emoji" w:hAnsi="Segoe UI Emoji" w:cs="Segoe UI Emoji"/>
+                </mc:Fallback>
+              </mc:AlternateContent>
+              <w:sz w:val="21"/>
+              <w:lang w:eastAsia="zh-CN"/>
+            </w:rPr>
+            <mc:AlternateContent>
+              <mc:Choice Requires="w16se">
+                <w16se:symEx w16se:font="Segoe UI Emoji" w16se:char="1F4E7"/>
+              </mc:Choice>
+              <mc:Fallback>
+                <w:t>📧</w:t>
+              </mc:Fallback>
+            </mc:AlternateContent>
+          </w:r>
+          <w:proofErr w:type="gramEnd"/>
+          <w:r>
+            <w:rPr>
+              <w:rFonts w:hint="eastAsia"/>
               <w:sz w:val="21"/>
               <w:lang w:eastAsia="zh-CN"/>
             </w:rPr>
@@ -1345,6 +1942,386 @@
         </w:p>
       </w:tc>
     </w:tr>
+  </w:tbl>
+  <w:p>
+    <w:pPr>
+      <w:pStyle w:val="a7"/>
+      <w:rPr>
+        <w:rFonts w:hint="eastAsia"/>
+      </w:rPr>
+    </w:pPr>
+  </w:p>
+</w:ftr>
+</file>
+
+<file path=word/footer2.xml><?xml version="1.0" encoding="utf-8"?>
+<w:ftr xmlns:wpc="http://schemas.microsoft.com/office/word/2010/wordprocessingCanvas" xmlns:cx="http://schemas.microsoft.com/office/drawing/2014/chartex" xmlns:cx1="http://schemas.microsoft.com/office/drawing/2015/9/8/chartex" xmlns:cx2="http://schemas.microsoft.com/office/drawing/2015/10/21/chartex" xmlns:cx3="http://schemas.microsoft.com/office/drawing/2016/5/9/chartex" xmlns:cx4="http://schemas.microsoft.com/office/drawing/2016/5/10/chartex" xmlns:cx5="http://schemas.microsoft.com/office/drawing/2016/5/11/chartex" xmlns:cx6="http://schemas.microsoft.com/office/drawing/2016/5/12/chartex" xmlns:cx7="http://schemas.microsoft.com/office/drawing/2016/5/13/chartex" xmlns:cx8="http://schemas.microsoft.com/office/drawing/2016/5/14/chartex" xmlns:mc="http://schemas.openxmlformats.org/markup-compatibility/2006" xmlns:aink="http://schemas.microsoft.com/office/drawing/2016/ink" xmlns:am3d="http://schemas.microsoft.com/office/drawing/2017/model3d" xmlns:o="urn:schemas-microsoft-com:office:office" xmlns:oel="http://schemas.microsoft.com/office/2019/extlst" xmlns:r="http://schemas.openxmlformats.org/officeDocument/2006/relationships" xmlns:m="http://schemas.openxmlformats.org/officeDocument/2006/math" xmlns:v="urn:schemas-microsoft-com:vml" xmlns:wp14="http://schemas.microsoft.com/office/word/2010/wordprocessingDrawing" xmlns:wp="http://schemas.openxmlformats.org/drawingml/2006/wordprocessingDrawing" xmlns:w10="urn:schemas-microsoft-com:office:word" xmlns:w="http://schemas.openxmlformats.org/wordprocessingml/2006/main" xmlns:w14="http://schemas.microsoft.com/office/word/2010/wordml" xmlns:w15="http://schemas.microsoft.com/office/word/2012/wordml" xmlns:w16cex="http://schemas.microsoft.com/office/word/2018/wordml/cex" xmlns:w16cid="http://schemas.microsoft.com/office/word/2016/wordml/cid" xmlns:w16="http://schemas.microsoft.com/office/word/2018/wordml" xmlns:w16du="http://schemas.microsoft.com/office/word/2023/wordml/word16du" xmlns:w16sdtdh="http://schemas.microsoft.com/office/word/2020/wordml/sdtdatahash" xmlns:w16sdtfl="http://schemas.microsoft.com/office/word/2024/wordml/sdtformatlock" xmlns:w16se="http://schemas.microsoft.com/office/word/2015/wordml/symex" xmlns:wpg="http://schemas.microsoft.com/office/word/2010/wordprocessingGroup" xmlns:wpi="http://schemas.microsoft.com/office/word/2010/wordprocessingInk" xmlns:wne="http://schemas.microsoft.com/office/word/2006/wordml" xmlns:wps="http://schemas.microsoft.com/office/word/2010/wordprocessingShape" mc:Ignorable="w14 w15 w16se w16cid w16 w16cex w16sdtdh w16sdtfl w16du wp14">
+  <w:tbl>
+    <w:tblPr>
+      <w:tblStyle w:val="a9"/>
+      <w:tblW w:w="8613" w:type="dxa"/>
+      <w:tblBorders>
+        <w:top w:val="none" w:sz="0" w:space="0" w:color="auto"/>
+        <w:left w:val="none" w:sz="0" w:space="0" w:color="auto"/>
+        <w:bottom w:val="none" w:sz="0" w:space="0" w:color="auto"/>
+        <w:right w:val="none" w:sz="0" w:space="0" w:color="auto"/>
+        <w:insideH w:val="none" w:sz="0" w:space="0" w:color="auto"/>
+        <w:insideV w:val="none" w:sz="0" w:space="0" w:color="auto"/>
+      </w:tblBorders>
+      <w:tblLook w:val="04A0" w:firstRow="1" w:lastRow="0" w:firstColumn="1" w:lastColumn="0" w:noHBand="0" w:noVBand="1"/>
+    </w:tblPr>
+    <w:tblGrid>
+      <w:gridCol w:w="6663"/>
+      <w:gridCol w:w="1950"/>
+    </w:tblGrid>
+    <w:tr>
+      <w:tc>
+        <w:tcPr>
+          <w:tcW w:w="6663" w:type="dxa"/>
+        </w:tcPr>
+        <w:p>
+          <w:pPr>
+            <w:pStyle w:val="a7"/>
+            <w:ind w:right="238"/>
+            <w:rPr>
+              <w:sz w:val="21"/>
+              <w:lang w:eastAsia="zh-CN"/>
+            </w:rPr>
+          </w:pPr>
+          <w:bookmarkStart w:id="8" w:name="_Hlk243065715"/>
+          <w:r>
+            <w:rPr>
+              <w:rFonts w:hint="eastAsia"/>
+              <w:sz w:val="21"/>
+              <w:lang w:eastAsia="zh-CN"/>
+            </w:rPr>
+            <w:t>地址：</w:t>
+          </w:r>
+          <w:r>
+            <w:rPr>
+              <w:rFonts w:hint="eastAsia"/>
+              <w:sz w:val="21"/>
+              <w:lang w:eastAsia="zh-CN"/>
+            </w:rPr>
+            <w:t>浙江省杭州市余杭区金恒路</w:t>
+          </w:r>
+          <w:r>
+            <w:rPr>
+              <w:rFonts w:hint="eastAsia"/>
+              <w:sz w:val="21"/>
+              <w:lang w:eastAsia="zh-CN"/>
+            </w:rPr>
+            <w:t>18</w:t>
+          </w:r>
+          <w:r>
+            <w:rPr>
+              <w:rFonts w:hint="eastAsia"/>
+              <w:sz w:val="21"/>
+              <w:lang w:eastAsia="zh-CN"/>
+            </w:rPr>
+            <w:t>号博多森谷</w:t>
+          </w:r>
+          <w:r>
+            <w:rPr>
+              <w:rFonts w:hint="eastAsia"/>
+              <w:sz w:val="21"/>
+              <w:lang w:eastAsia="zh-CN"/>
+            </w:rPr>
+            <w:t>2</w:t>
+          </w:r>
+          <w:r>
+            <w:rPr>
+              <w:rFonts w:hint="eastAsia"/>
+              <w:sz w:val="21"/>
+              <w:lang w:eastAsia="zh-CN"/>
+            </w:rPr>
+            <w:t>号楼</w:t>
+          </w:r>
+          <w:r>
+            <w:rPr>
+              <w:rFonts w:hint="eastAsia"/>
+              <w:sz w:val="21"/>
+              <w:lang w:eastAsia="zh-CN"/>
+            </w:rPr>
+            <w:t>4</w:t>
+          </w:r>
+          <w:r>
+            <w:rPr>
+              <w:rFonts w:hint="eastAsia"/>
+              <w:sz w:val="21"/>
+              <w:lang w:eastAsia="zh-CN"/>
+            </w:rPr>
+            <w:t>楼</w:t>
+          </w:r>
+          <w:r>
+            <w:rPr>
+              <w:rFonts w:hint="eastAsia"/>
+              <w:sz w:val="21"/>
+              <w:lang w:eastAsia="zh-CN"/>
+            </w:rPr>
+            <w:t>D-16</w:t>
+          </w:r>
+        </w:p>
+      </w:tc>
+      <w:tc>
+        <w:tcPr>
+          <w:tcW w:w="1950" w:type="dxa"/>
+        </w:tcPr>
+        <w:p>
+          <w:pPr>
+            <w:pStyle w:val="a7"/>
+            <w:ind w:right="238"/>
+            <w:jc w:val="right"/>
+            <w:rPr>
+              <w:sz w:val="21"/>
+              <w:lang w:eastAsia="zh-CN"/>
+            </w:rPr>
+          </w:pPr>
+          <w:r>
+            <w:rPr>
+              <w:sz w:val="21"/>
+              <w:lang w:val="zh-CN" w:eastAsia="zh-CN"/>
+            </w:rPr>
+            <w:t xml:space="preserve"> </w:t>
+          </w:r>
+          <w:r>
+            <w:rPr>
+              <w:b/>
+              <w:bCs/>
+              <w:sz w:val="21"/>
+            </w:rPr>
+            <w:fldChar w:fldCharType="begin"/>
+          </w:r>
+          <w:r>
+            <w:rPr>
+              <w:b/>
+              <w:bCs/>
+              <w:sz w:val="21"/>
+              <w:lang w:eastAsia="zh-CN"/>
+            </w:rPr>
+            <w:instrText>PAGE  \* Arabic  \* MERGEFORMAT</w:instrText>
+          </w:r>
+          <w:r>
+            <w:rPr>
+              <w:b/>
+              <w:bCs/>
+              <w:sz w:val="21"/>
+            </w:rPr>
+            <w:fldChar w:fldCharType="separate"/>
+          </w:r>
+          <w:r>
+            <w:rPr>
+              <w:b/>
+              <w:bCs/>
+              <w:sz w:val="21"/>
+              <w:lang w:val="zh-CN" w:eastAsia="zh-CN"/>
+            </w:rPr>
+            <w:t>1</w:t>
+          </w:r>
+          <w:r>
+            <w:rPr>
+              <w:b/>
+              <w:bCs/>
+              <w:sz w:val="21"/>
+            </w:rPr>
+            <w:fldChar w:fldCharType="end"/>
+          </w:r>
+          <w:r>
+            <w:rPr>
+              <w:sz w:val="21"/>
+              <w:lang w:val="zh-CN" w:eastAsia="zh-CN"/>
+            </w:rPr>
+            <w:t xml:space="preserve"> / </w:t>
+          </w:r>
+          <w:r>
+            <w:rPr>
+              <w:b/>
+              <w:bCs/>
+              <w:sz w:val="21"/>
+            </w:rPr>
+            <w:fldChar w:fldCharType="begin"/>
+          </w:r>
+          <w:r>
+            <w:rPr>
+              <w:b/>
+              <w:bCs/>
+              <w:sz w:val="21"/>
+              <w:lang w:eastAsia="zh-CN"/>
+            </w:rPr>
+            <w:instrText>NUMPAGES  \* Arabic  \* MERGEFORMAT</w:instrText>
+          </w:r>
+          <w:r>
+            <w:rPr>
+              <w:b/>
+              <w:bCs/>
+              <w:sz w:val="21"/>
+            </w:rPr>
+            <w:fldChar w:fldCharType="separate"/>
+          </w:r>
+          <w:r>
+            <w:rPr>
+              <w:b/>
+              <w:bCs/>
+              <w:sz w:val="21"/>
+              <w:lang w:val="zh-CN" w:eastAsia="zh-CN"/>
+            </w:rPr>
+            <w:t>2</w:t>
+          </w:r>
+          <w:r>
+            <w:rPr>
+              <w:b/>
+              <w:bCs/>
+              <w:sz w:val="21"/>
+            </w:rPr>
+            <w:fldChar w:fldCharType="end"/>
+          </w:r>
+        </w:p>
+      </w:tc>
+    </w:tr>
+    <w:tr>
+      <w:tc>
+        <w:tcPr>
+          <w:tcW w:w="6663" w:type="dxa"/>
+        </w:tcPr>
+        <w:p>
+          <w:pPr>
+            <w:pStyle w:val="a7"/>
+            <w:ind w:right="238"/>
+            <w:rPr>
+              <w:sz w:val="21"/>
+              <w:lang w:eastAsia="zh-CN"/>
+            </w:rPr>
+          </w:pPr>
+          <w:r>
+            <w:rPr>
+              <w:rFonts w:hint="eastAsia"/>
+              <w:sz w:val="21"/>
+              <w:lang w:eastAsia="zh-CN"/>
+            </w:rPr>
+            <w:t>周豪</w:t>
+          </w:r>
+          <w:proofErr w:type="gramStart"/>
+          <w:r>
+            <w:rPr>
+              <w:rFonts w:hint="eastAsia"/>
+              <w:sz w:val="21"/>
+              <w:lang w:eastAsia="zh-CN"/>
+            </w:rPr>
+            <w:t>靖</w:t>
+          </w:r>
+          <w:r>
+            <w:rPr>
+              <w:rFonts w:hint="eastAsia"/>
+              <w:sz w:val="21"/>
+              <w:lang w:eastAsia="zh-CN"/>
+            </w:rPr>
+            <w:t xml:space="preserve"> </w:t>
+          </w:r>
+          <w:r>
+            <w:rPr>
+              <mc:AlternateContent>
+                <mc:Choice Requires="w16se">
+                  <w:rFonts w:hint="eastAsia"/>
+                </mc:Choice>
+                <mc:Fallback>
+                  <w:rFonts w:ascii="Segoe UI Emoji" w:eastAsia="Segoe UI Emoji" w:hAnsi="Segoe UI Emoji" w:cs="Segoe UI Emoji"/>
+                </mc:Fallback>
+              </mc:AlternateContent>
+              <w:sz w:val="21"/>
+              <w:lang w:eastAsia="zh-CN"/>
+            </w:rPr>
+            <mc:AlternateContent>
+              <mc:Choice Requires="w16se">
+                <w16se:symEx w16se:font="Segoe UI Emoji" w16se:char="260E"/>
+              </mc:Choice>
+              <mc:Fallback>
+                <w:t>☎</w:t>
+              </mc:Fallback>
+            </mc:AlternateContent>
+          </w:r>
+          <w:proofErr w:type="gramEnd"/>
+          <w:r>
+            <w:rPr>
+              <w:rFonts w:hint="eastAsia"/>
+              <w:sz w:val="21"/>
+              <w:lang w:eastAsia="zh-CN"/>
+            </w:rPr>
+            <w:t>️</w:t>
+          </w:r>
+          <w:proofErr w:type="gramStart"/>
+          <w:r>
+            <w:rPr>
+              <w:rFonts w:hint="eastAsia"/>
+              <w:sz w:val="21"/>
+              <w:lang w:eastAsia="zh-CN"/>
+            </w:rPr>
+            <w:t>13173678927</w:t>
+          </w:r>
+          <w:r>
+            <w:rPr>
+              <w:sz w:val="21"/>
+              <w:lang w:eastAsia="zh-CN"/>
+            </w:rPr>
+            <w:t xml:space="preserve"> </w:t>
+          </w:r>
+          <w:r>
+            <w:rPr>
+              <w:rFonts w:hint="eastAsia"/>
+              <w:sz w:val="21"/>
+              <w:lang w:eastAsia="zh-CN"/>
+            </w:rPr>
+            <w:t xml:space="preserve"> </w:t>
+          </w:r>
+          <w:r>
+            <w:rPr>
+              <mc:AlternateContent>
+                <mc:Choice Requires="w16se">
+                  <w:rFonts w:hint="eastAsia"/>
+                </mc:Choice>
+                <mc:Fallback>
+                  <w:rFonts w:ascii="Segoe UI Emoji" w:eastAsia="Segoe UI Emoji" w:hAnsi="Segoe UI Emoji" w:cs="Segoe UI Emoji"/>
+                </mc:Fallback>
+              </mc:AlternateContent>
+              <w:sz w:val="21"/>
+              <w:lang w:eastAsia="zh-CN"/>
+            </w:rPr>
+            <mc:AlternateContent>
+              <mc:Choice Requires="w16se">
+                <w16se:symEx w16se:font="Segoe UI Emoji" w16se:char="1F4E7"/>
+              </mc:Choice>
+              <mc:Fallback>
+                <w:t>📧</w:t>
+              </mc:Fallback>
+            </mc:AlternateContent>
+          </w:r>
+          <w:proofErr w:type="gramEnd"/>
+          <w:r>
+            <w:rPr>
+              <w:rFonts w:hint="eastAsia"/>
+              <w:sz w:val="21"/>
+              <w:lang w:eastAsia="zh-CN"/>
+            </w:rPr>
+            <w:t>zhjwork@gmail.com</w:t>
+          </w:r>
+        </w:p>
+      </w:tc>
+      <w:tc>
+        <w:tcPr>
+          <w:tcW w:w="1950" w:type="dxa"/>
+        </w:tcPr>
+        <w:p>
+          <w:pPr>
+            <w:pStyle w:val="a7"/>
+            <w:ind w:right="238"/>
+            <w:rPr>
+              <w:sz w:val="21"/>
+              <w:lang w:eastAsia="zh-CN"/>
+            </w:rPr>
+          </w:pPr>
+        </w:p>
+      </w:tc>
+    </w:tr>
+    <w:bookmarkEnd w:id="8"/>
   </w:tbl>
   <w:p>
     <w:pPr>
@@ -1374,16 +2351,6 @@
 </file>
 
 <file path=word/header1.xml><?xml version="1.0" encoding="utf-8"?>
-<w:hdr xmlns:wpc="http://schemas.microsoft.com/office/word/2010/wordprocessingCanvas" xmlns:cx="http://schemas.microsoft.com/office/drawing/2014/chartex" xmlns:cx1="http://schemas.microsoft.com/office/drawing/2015/9/8/chartex" xmlns:cx2="http://schemas.microsoft.com/office/drawing/2015/10/21/chartex" xmlns:cx3="http://schemas.microsoft.com/office/drawing/2016/5/9/chartex" xmlns:cx4="http://schemas.microsoft.com/office/drawing/2016/5/10/chartex" xmlns:cx5="http://schemas.microsoft.com/office/drawing/2016/5/11/chartex" xmlns:cx6="http://schemas.microsoft.com/office/drawing/2016/5/12/chartex" xmlns:cx7="http://schemas.microsoft.com/office/drawing/2016/5/13/chartex" xmlns:cx8="http://schemas.microsoft.com/office/drawing/2016/5/14/chartex" xmlns:mc="http://schemas.openxmlformats.org/markup-compatibility/2006" xmlns:aink="http://schemas.microsoft.com/office/drawing/2016/ink" xmlns:am3d="http://schemas.microsoft.com/office/drawing/2017/model3d" xmlns:o="urn:schemas-microsoft-com:office:office" xmlns:oel="http://schemas.microsoft.com/office/2019/extlst" xmlns:r="http://schemas.openxmlformats.org/officeDocument/2006/relationships" xmlns:m="http://schemas.openxmlformats.org/officeDocument/2006/math" xmlns:v="urn:schemas-microsoft-com:vml" xmlns:wp14="http://schemas.microsoft.com/office/word/2010/wordprocessingDrawing" xmlns:wp="http://schemas.openxmlformats.org/drawingml/2006/wordprocessingDrawing" xmlns:w10="urn:schemas-microsoft-com:office:word" xmlns:w="http://schemas.openxmlformats.org/wordprocessingml/2006/main" xmlns:w14="http://schemas.microsoft.com/office/word/2010/wordml" xmlns:w15="http://schemas.microsoft.com/office/word/2012/wordml" xmlns:w16cex="http://schemas.microsoft.com/office/word/2018/wordml/cex" xmlns:w16cid="http://schemas.microsoft.com/office/word/2016/wordml/cid" xmlns:w16="http://schemas.microsoft.com/office/word/2018/wordml" xmlns:w16du="http://schemas.microsoft.com/office/word/2023/wordml/word16du" xmlns:w16sdtdh="http://schemas.microsoft.com/office/word/2020/wordml/sdtdatahash" xmlns:w16sdtfl="http://schemas.microsoft.com/office/word/2024/wordml/sdtformatlock" xmlns:w16se="http://schemas.microsoft.com/office/word/2015/wordml/symex" xmlns:wpg="http://schemas.microsoft.com/office/word/2010/wordprocessingGroup" xmlns:wpi="http://schemas.microsoft.com/office/word/2010/wordprocessingInk" xmlns:wne="http://schemas.microsoft.com/office/word/2006/wordml" xmlns:wps="http://schemas.microsoft.com/office/word/2010/wordprocessingShape" mc:Ignorable="w14 w15 w16se w16cid w16 w16cex w16sdtdh w16sdtfl w16du wp14">
-  <w:p>
-    <w:pPr>
-      <w:pStyle w:val="a5"/>
-    </w:pPr>
-  </w:p>
-</w:hdr>
-</file>
-
-<file path=word/header2.xml><?xml version="1.0" encoding="utf-8"?>
 <w:hdr xmlns:wpc="http://schemas.microsoft.com/office/word/2010/wordprocessingCanvas" xmlns:cx="http://schemas.microsoft.com/office/drawing/2014/chartex" xmlns:cx1="http://schemas.microsoft.com/office/drawing/2015/9/8/chartex" xmlns:cx2="http://schemas.microsoft.com/office/drawing/2015/10/21/chartex" xmlns:cx3="http://schemas.microsoft.com/office/drawing/2016/5/9/chartex" xmlns:cx4="http://schemas.microsoft.com/office/drawing/2016/5/10/chartex" xmlns:cx5="http://schemas.microsoft.com/office/drawing/2016/5/11/chartex" xmlns:cx6="http://schemas.microsoft.com/office/drawing/2016/5/12/chartex" xmlns:cx7="http://schemas.microsoft.com/office/drawing/2016/5/13/chartex" xmlns:cx8="http://schemas.microsoft.com/office/drawing/2016/5/14/chartex" xmlns:mc="http://schemas.openxmlformats.org/markup-compatibility/2006" xmlns:aink="http://schemas.microsoft.com/office/drawing/2016/ink" xmlns:am3d="http://schemas.microsoft.com/office/drawing/2017/model3d" xmlns:o="urn:schemas-microsoft-com:office:office" xmlns:oel="http://schemas.microsoft.com/office/2019/extlst" xmlns:r="http://schemas.openxmlformats.org/officeDocument/2006/relationships" xmlns:m="http://schemas.openxmlformats.org/officeDocument/2006/math" xmlns:v="urn:schemas-microsoft-com:vml" xmlns:wp14="http://schemas.microsoft.com/office/word/2010/wordprocessingDrawing" xmlns:wp="http://schemas.openxmlformats.org/drawingml/2006/wordprocessingDrawing" xmlns:w10="urn:schemas-microsoft-com:office:word" xmlns:w="http://schemas.openxmlformats.org/wordprocessingml/2006/main" xmlns:w14="http://schemas.microsoft.com/office/word/2010/wordml" xmlns:w15="http://schemas.microsoft.com/office/word/2012/wordml" xmlns:w16cex="http://schemas.microsoft.com/office/word/2018/wordml/cex" xmlns:w16cid="http://schemas.microsoft.com/office/word/2016/wordml/cid" xmlns:w16="http://schemas.microsoft.com/office/word/2018/wordml" xmlns:w16du="http://schemas.microsoft.com/office/word/2023/wordml/word16du" xmlns:w16sdtdh="http://schemas.microsoft.com/office/word/2020/wordml/sdtdatahash" xmlns:w16sdtfl="http://schemas.microsoft.com/office/word/2024/wordml/sdtformatlock" xmlns:w16se="http://schemas.microsoft.com/office/word/2015/wordml/symex" xmlns:wpg="http://schemas.microsoft.com/office/word/2010/wordprocessingGroup" xmlns:wpi="http://schemas.microsoft.com/office/word/2010/wordprocessingInk" xmlns:wne="http://schemas.microsoft.com/office/word/2006/wordml" xmlns:wps="http://schemas.microsoft.com/office/word/2010/wordprocessingShape" mc:Ignorable="w14 w15 w16se w16cid w16 w16cex w16sdtdh w16sdtfl w16du wp14">
   <w:p>
     <w:pPr>
@@ -1468,7 +2435,7 @@
 </w:hdr>
 </file>
 
-<file path=word/header3.xml><?xml version="1.0" encoding="utf-8"?>
+<file path=word/header2.xml><?xml version="1.0" encoding="utf-8"?>
 <w:hdr xmlns:wpc="http://schemas.microsoft.com/office/word/2010/wordprocessingCanvas" xmlns:cx="http://schemas.microsoft.com/office/drawing/2014/chartex" xmlns:cx1="http://schemas.microsoft.com/office/drawing/2015/9/8/chartex" xmlns:cx2="http://schemas.microsoft.com/office/drawing/2015/10/21/chartex" xmlns:cx3="http://schemas.microsoft.com/office/drawing/2016/5/9/chartex" xmlns:cx4="http://schemas.microsoft.com/office/drawing/2016/5/10/chartex" xmlns:cx5="http://schemas.microsoft.com/office/drawing/2016/5/11/chartex" xmlns:cx6="http://schemas.microsoft.com/office/drawing/2016/5/12/chartex" xmlns:cx7="http://schemas.microsoft.com/office/drawing/2016/5/13/chartex" xmlns:cx8="http://schemas.microsoft.com/office/drawing/2016/5/14/chartex" xmlns:mc="http://schemas.openxmlformats.org/markup-compatibility/2006" xmlns:aink="http://schemas.microsoft.com/office/drawing/2016/ink" xmlns:am3d="http://schemas.microsoft.com/office/drawing/2017/model3d" xmlns:o="urn:schemas-microsoft-com:office:office" xmlns:oel="http://schemas.microsoft.com/office/2019/extlst" xmlns:r="http://schemas.openxmlformats.org/officeDocument/2006/relationships" xmlns:m="http://schemas.openxmlformats.org/officeDocument/2006/math" xmlns:v="urn:schemas-microsoft-com:vml" xmlns:wp14="http://schemas.microsoft.com/office/word/2010/wordprocessingDrawing" xmlns:wp="http://schemas.openxmlformats.org/drawingml/2006/wordprocessingDrawing" xmlns:w10="urn:schemas-microsoft-com:office:word" xmlns:w="http://schemas.openxmlformats.org/wordprocessingml/2006/main" xmlns:w14="http://schemas.microsoft.com/office/word/2010/wordml" xmlns:w15="http://schemas.microsoft.com/office/word/2012/wordml" xmlns:w16cex="http://schemas.microsoft.com/office/word/2018/wordml/cex" xmlns:w16cid="http://schemas.microsoft.com/office/word/2016/wordml/cid" xmlns:w16="http://schemas.microsoft.com/office/word/2018/wordml" xmlns:w16du="http://schemas.microsoft.com/office/word/2023/wordml/word16du" xmlns:w16sdtdh="http://schemas.microsoft.com/office/word/2020/wordml/sdtdatahash" xmlns:w16sdtfl="http://schemas.microsoft.com/office/word/2024/wordml/sdtformatlock" xmlns:w16se="http://schemas.microsoft.com/office/word/2015/wordml/symex" xmlns:wpg="http://schemas.microsoft.com/office/word/2010/wordprocessingGroup" xmlns:wpi="http://schemas.microsoft.com/office/word/2010/wordprocessingInk" xmlns:wne="http://schemas.microsoft.com/office/word/2006/wordml" xmlns:wps="http://schemas.microsoft.com/office/word/2010/wordprocessingShape" mc:Ignorable="w14 w15 w16se w16cid w16 w16cex w16sdtdh w16sdtfl w16du wp14">
   <w:p>
     <w:pPr>
@@ -3173,7 +4140,7 @@
       <w:outlineLvl w:val="0"/>
     </w:pPr>
     <w:rPr>
-      <w:rFonts w:eastAsia="黑体"/>
+      <w:rFonts w:eastAsia="SimHei"/>
       <w:b/>
       <w:bCs/>
       <w:kern w:val="44"/>
@@ -3400,7 +4367,7 @@
     <w:uiPriority w:val="9"/>
     <w:rsid w:val="00017ACF"/>
     <w:rPr>
-      <w:rFonts w:ascii="Times New Roman" w:eastAsia="黑体" w:hAnsi="Times New Roman"/>
+      <w:rFonts w:ascii="Times New Roman" w:eastAsia="SimHei" w:hAnsi="Times New Roman"/>
       <w:b/>
       <w:bCs/>
       <w:kern w:val="44"/>
@@ -3611,7 +4578,7 @@
       <w:ind w:leftChars="100" w:left="100" w:right="482" w:firstLine="480"/>
     </w:pPr>
     <w:rPr>
-      <w:rFonts w:eastAsia="楷体"/>
+      <w:rFonts w:eastAsia="KaiTi"/>
       <w:kern w:val="0"/>
       <w:sz w:val="24"/>
       <w:szCs w:val="24"/>

</xml_diff>